<commit_message>
Call the font what Word calls it: Big Caslon Medium
The preflight refused the batch: Word's process cannot list "Big
Caslon". Its own name for the family is "Big Caslon Medium", which does
not match the filename. Caught before the capture, which is the whole
point of checking what the Word process can see rather than what is on
disk -- had it gone ahead, that group would have been substituted with
some other face and nothing in the geometry would have shown it.

Only the font's name changed. R0, R1, R2, the candidate list, the
tolerance and the falsifiers are untouched, and the criteria still
identify the right unit uniquely in all three synthetic worlds.

Co-Authored-By: Claude Opus 5 (1M context) <noreply@anthropic.com>
</commit_message>
<xml_diff>
--- a/fixtures/cursor-unit.docx
+++ b/fixtures/cursor-unit.docx
@@ -3030,14 +3030,14 @@
         <w:jc w:val="left"/>
         <w:widowControl w:val="0"/>
         <w:rPr>
-          <w:rFonts w:ascii="Big Caslon" w:hAnsi="Big Caslon" w:eastAsia="Big Caslon" w:cs="Big Caslon"/>
-          <w:sz w:val="12"/>
-          <w:szCs w:val="12"/>
-        </w:rPr>
-      </w:pPr>
-      <w:r>
-        <w:rPr>
-          <w:rFonts w:ascii="Big Caslon" w:hAnsi="Big Caslon" w:eastAsia="Big Caslon" w:cs="Big Caslon"/>
+          <w:rFonts w:ascii="Big Caslon Medium" w:hAnsi="Big Caslon Medium" w:eastAsia="Big Caslon Medium" w:cs="Big Caslon Medium"/>
+          <w:sz w:val="12"/>
+          <w:szCs w:val="12"/>
+        </w:rPr>
+      </w:pPr>
+      <w:r>
+        <w:rPr>
+          <w:rFonts w:ascii="Big Caslon Medium" w:hAnsi="Big Caslon Medium" w:eastAsia="Big Caslon Medium" w:cs="Big Caslon Medium"/>
           <w:sz w:val="12"/>
           <w:szCs w:val="12"/>
         </w:rPr>
@@ -3050,14 +3050,14 @@
         <w:jc w:val="left"/>
         <w:widowControl w:val="0"/>
         <w:rPr>
-          <w:rFonts w:ascii="Big Caslon" w:hAnsi="Big Caslon" w:eastAsia="Big Caslon" w:cs="Big Caslon"/>
-          <w:sz w:val="12"/>
-          <w:szCs w:val="12"/>
-        </w:rPr>
-      </w:pPr>
-      <w:r>
-        <w:rPr>
-          <w:rFonts w:ascii="Big Caslon" w:hAnsi="Big Caslon" w:eastAsia="Big Caslon" w:cs="Big Caslon"/>
+          <w:rFonts w:ascii="Big Caslon Medium" w:hAnsi="Big Caslon Medium" w:eastAsia="Big Caslon Medium" w:cs="Big Caslon Medium"/>
+          <w:sz w:val="12"/>
+          <w:szCs w:val="12"/>
+        </w:rPr>
+      </w:pPr>
+      <w:r>
+        <w:rPr>
+          <w:rFonts w:ascii="Big Caslon Medium" w:hAnsi="Big Caslon Medium" w:eastAsia="Big Caslon Medium" w:cs="Big Caslon Medium"/>
           <w:sz w:val="12"/>
           <w:szCs w:val="12"/>
         </w:rPr>
@@ -3070,14 +3070,14 @@
         <w:jc w:val="left"/>
         <w:widowControl w:val="0"/>
         <w:rPr>
-          <w:rFonts w:ascii="Big Caslon" w:hAnsi="Big Caslon" w:eastAsia="Big Caslon" w:cs="Big Caslon"/>
-          <w:sz w:val="12"/>
-          <w:szCs w:val="12"/>
-        </w:rPr>
-      </w:pPr>
-      <w:r>
-        <w:rPr>
-          <w:rFonts w:ascii="Big Caslon" w:hAnsi="Big Caslon" w:eastAsia="Big Caslon" w:cs="Big Caslon"/>
+          <w:rFonts w:ascii="Big Caslon Medium" w:hAnsi="Big Caslon Medium" w:eastAsia="Big Caslon Medium" w:cs="Big Caslon Medium"/>
+          <w:sz w:val="12"/>
+          <w:szCs w:val="12"/>
+        </w:rPr>
+      </w:pPr>
+      <w:r>
+        <w:rPr>
+          <w:rFonts w:ascii="Big Caslon Medium" w:hAnsi="Big Caslon Medium" w:eastAsia="Big Caslon Medium" w:cs="Big Caslon Medium"/>
           <w:sz w:val="12"/>
           <w:szCs w:val="12"/>
         </w:rPr>
@@ -3090,14 +3090,14 @@
         <w:jc w:val="left"/>
         <w:widowControl w:val="0"/>
         <w:rPr>
-          <w:rFonts w:ascii="Big Caslon" w:hAnsi="Big Caslon" w:eastAsia="Big Caslon" w:cs="Big Caslon"/>
-          <w:sz w:val="12"/>
-          <w:szCs w:val="12"/>
-        </w:rPr>
-      </w:pPr>
-      <w:r>
-        <w:rPr>
-          <w:rFonts w:ascii="Big Caslon" w:hAnsi="Big Caslon" w:eastAsia="Big Caslon" w:cs="Big Caslon"/>
+          <w:rFonts w:ascii="Big Caslon Medium" w:hAnsi="Big Caslon Medium" w:eastAsia="Big Caslon Medium" w:cs="Big Caslon Medium"/>
+          <w:sz w:val="12"/>
+          <w:szCs w:val="12"/>
+        </w:rPr>
+      </w:pPr>
+      <w:r>
+        <w:rPr>
+          <w:rFonts w:ascii="Big Caslon Medium" w:hAnsi="Big Caslon Medium" w:eastAsia="Big Caslon Medium" w:cs="Big Caslon Medium"/>
           <w:sz w:val="12"/>
           <w:szCs w:val="12"/>
         </w:rPr>
@@ -3110,14 +3110,14 @@
         <w:jc w:val="left"/>
         <w:widowControl w:val="0"/>
         <w:rPr>
-          <w:rFonts w:ascii="Big Caslon" w:hAnsi="Big Caslon" w:eastAsia="Big Caslon" w:cs="Big Caslon"/>
-          <w:sz w:val="12"/>
-          <w:szCs w:val="12"/>
-        </w:rPr>
-      </w:pPr>
-      <w:r>
-        <w:rPr>
-          <w:rFonts w:ascii="Big Caslon" w:hAnsi="Big Caslon" w:eastAsia="Big Caslon" w:cs="Big Caslon"/>
+          <w:rFonts w:ascii="Big Caslon Medium" w:hAnsi="Big Caslon Medium" w:eastAsia="Big Caslon Medium" w:cs="Big Caslon Medium"/>
+          <w:sz w:val="12"/>
+          <w:szCs w:val="12"/>
+        </w:rPr>
+      </w:pPr>
+      <w:r>
+        <w:rPr>
+          <w:rFonts w:ascii="Big Caslon Medium" w:hAnsi="Big Caslon Medium" w:eastAsia="Big Caslon Medium" w:cs="Big Caslon Medium"/>
           <w:sz w:val="12"/>
           <w:szCs w:val="12"/>
         </w:rPr>
@@ -3130,14 +3130,14 @@
         <w:jc w:val="left"/>
         <w:widowControl w:val="0"/>
         <w:rPr>
-          <w:rFonts w:ascii="Big Caslon" w:hAnsi="Big Caslon" w:eastAsia="Big Caslon" w:cs="Big Caslon"/>
-          <w:sz w:val="12"/>
-          <w:szCs w:val="12"/>
-        </w:rPr>
-      </w:pPr>
-      <w:r>
-        <w:rPr>
-          <w:rFonts w:ascii="Big Caslon" w:hAnsi="Big Caslon" w:eastAsia="Big Caslon" w:cs="Big Caslon"/>
+          <w:rFonts w:ascii="Big Caslon Medium" w:hAnsi="Big Caslon Medium" w:eastAsia="Big Caslon Medium" w:cs="Big Caslon Medium"/>
+          <w:sz w:val="12"/>
+          <w:szCs w:val="12"/>
+        </w:rPr>
+      </w:pPr>
+      <w:r>
+        <w:rPr>
+          <w:rFonts w:ascii="Big Caslon Medium" w:hAnsi="Big Caslon Medium" w:eastAsia="Big Caslon Medium" w:cs="Big Caslon Medium"/>
           <w:sz w:val="12"/>
           <w:szCs w:val="12"/>
         </w:rPr>
@@ -3150,14 +3150,14 @@
         <w:jc w:val="left"/>
         <w:widowControl w:val="0"/>
         <w:rPr>
-          <w:rFonts w:ascii="Big Caslon" w:hAnsi="Big Caslon" w:eastAsia="Big Caslon" w:cs="Big Caslon"/>
-          <w:sz w:val="12"/>
-          <w:szCs w:val="12"/>
-        </w:rPr>
-      </w:pPr>
-      <w:r>
-        <w:rPr>
-          <w:rFonts w:ascii="Big Caslon" w:hAnsi="Big Caslon" w:eastAsia="Big Caslon" w:cs="Big Caslon"/>
+          <w:rFonts w:ascii="Big Caslon Medium" w:hAnsi="Big Caslon Medium" w:eastAsia="Big Caslon Medium" w:cs="Big Caslon Medium"/>
+          <w:sz w:val="12"/>
+          <w:szCs w:val="12"/>
+        </w:rPr>
+      </w:pPr>
+      <w:r>
+        <w:rPr>
+          <w:rFonts w:ascii="Big Caslon Medium" w:hAnsi="Big Caslon Medium" w:eastAsia="Big Caslon Medium" w:cs="Big Caslon Medium"/>
           <w:sz w:val="12"/>
           <w:szCs w:val="12"/>
         </w:rPr>
@@ -3170,14 +3170,14 @@
         <w:jc w:val="left"/>
         <w:widowControl w:val="0"/>
         <w:rPr>
-          <w:rFonts w:ascii="Big Caslon" w:hAnsi="Big Caslon" w:eastAsia="Big Caslon" w:cs="Big Caslon"/>
-          <w:sz w:val="12"/>
-          <w:szCs w:val="12"/>
-        </w:rPr>
-      </w:pPr>
-      <w:r>
-        <w:rPr>
-          <w:rFonts w:ascii="Big Caslon" w:hAnsi="Big Caslon" w:eastAsia="Big Caslon" w:cs="Big Caslon"/>
+          <w:rFonts w:ascii="Big Caslon Medium" w:hAnsi="Big Caslon Medium" w:eastAsia="Big Caslon Medium" w:cs="Big Caslon Medium"/>
+          <w:sz w:val="12"/>
+          <w:szCs w:val="12"/>
+        </w:rPr>
+      </w:pPr>
+      <w:r>
+        <w:rPr>
+          <w:rFonts w:ascii="Big Caslon Medium" w:hAnsi="Big Caslon Medium" w:eastAsia="Big Caslon Medium" w:cs="Big Caslon Medium"/>
           <w:sz w:val="12"/>
           <w:szCs w:val="12"/>
         </w:rPr>
@@ -3190,14 +3190,14 @@
         <w:jc w:val="left"/>
         <w:widowControl w:val="0"/>
         <w:rPr>
-          <w:rFonts w:ascii="Big Caslon" w:hAnsi="Big Caslon" w:eastAsia="Big Caslon" w:cs="Big Caslon"/>
-          <w:sz w:val="12"/>
-          <w:szCs w:val="12"/>
-        </w:rPr>
-      </w:pPr>
-      <w:r>
-        <w:rPr>
-          <w:rFonts w:ascii="Big Caslon" w:hAnsi="Big Caslon" w:eastAsia="Big Caslon" w:cs="Big Caslon"/>
+          <w:rFonts w:ascii="Big Caslon Medium" w:hAnsi="Big Caslon Medium" w:eastAsia="Big Caslon Medium" w:cs="Big Caslon Medium"/>
+          <w:sz w:val="12"/>
+          <w:szCs w:val="12"/>
+        </w:rPr>
+      </w:pPr>
+      <w:r>
+        <w:rPr>
+          <w:rFonts w:ascii="Big Caslon Medium" w:hAnsi="Big Caslon Medium" w:eastAsia="Big Caslon Medium" w:cs="Big Caslon Medium"/>
           <w:sz w:val="12"/>
           <w:szCs w:val="12"/>
         </w:rPr>
@@ -3210,14 +3210,14 @@
         <w:jc w:val="left"/>
         <w:widowControl w:val="0"/>
         <w:rPr>
-          <w:rFonts w:ascii="Big Caslon" w:hAnsi="Big Caslon" w:eastAsia="Big Caslon" w:cs="Big Caslon"/>
-          <w:sz w:val="12"/>
-          <w:szCs w:val="12"/>
-        </w:rPr>
-      </w:pPr>
-      <w:r>
-        <w:rPr>
-          <w:rFonts w:ascii="Big Caslon" w:hAnsi="Big Caslon" w:eastAsia="Big Caslon" w:cs="Big Caslon"/>
+          <w:rFonts w:ascii="Big Caslon Medium" w:hAnsi="Big Caslon Medium" w:eastAsia="Big Caslon Medium" w:cs="Big Caslon Medium"/>
+          <w:sz w:val="12"/>
+          <w:szCs w:val="12"/>
+        </w:rPr>
+      </w:pPr>
+      <w:r>
+        <w:rPr>
+          <w:rFonts w:ascii="Big Caslon Medium" w:hAnsi="Big Caslon Medium" w:eastAsia="Big Caslon Medium" w:cs="Big Caslon Medium"/>
           <w:sz w:val="12"/>
           <w:szCs w:val="12"/>
         </w:rPr>
@@ -3230,14 +3230,14 @@
         <w:jc w:val="left"/>
         <w:widowControl w:val="0"/>
         <w:rPr>
-          <w:rFonts w:ascii="Big Caslon" w:hAnsi="Big Caslon" w:eastAsia="Big Caslon" w:cs="Big Caslon"/>
-          <w:sz w:val="12"/>
-          <w:szCs w:val="12"/>
-        </w:rPr>
-      </w:pPr>
-      <w:r>
-        <w:rPr>
-          <w:rFonts w:ascii="Big Caslon" w:hAnsi="Big Caslon" w:eastAsia="Big Caslon" w:cs="Big Caslon"/>
+          <w:rFonts w:ascii="Big Caslon Medium" w:hAnsi="Big Caslon Medium" w:eastAsia="Big Caslon Medium" w:cs="Big Caslon Medium"/>
+          <w:sz w:val="12"/>
+          <w:szCs w:val="12"/>
+        </w:rPr>
+      </w:pPr>
+      <w:r>
+        <w:rPr>
+          <w:rFonts w:ascii="Big Caslon Medium" w:hAnsi="Big Caslon Medium" w:eastAsia="Big Caslon Medium" w:cs="Big Caslon Medium"/>
           <w:sz w:val="12"/>
           <w:szCs w:val="12"/>
         </w:rPr>
@@ -3250,14 +3250,14 @@
         <w:jc w:val="left"/>
         <w:widowControl w:val="0"/>
         <w:rPr>
-          <w:rFonts w:ascii="Big Caslon" w:hAnsi="Big Caslon" w:eastAsia="Big Caslon" w:cs="Big Caslon"/>
-          <w:sz w:val="12"/>
-          <w:szCs w:val="12"/>
-        </w:rPr>
-      </w:pPr>
-      <w:r>
-        <w:rPr>
-          <w:rFonts w:ascii="Big Caslon" w:hAnsi="Big Caslon" w:eastAsia="Big Caslon" w:cs="Big Caslon"/>
+          <w:rFonts w:ascii="Big Caslon Medium" w:hAnsi="Big Caslon Medium" w:eastAsia="Big Caslon Medium" w:cs="Big Caslon Medium"/>
+          <w:sz w:val="12"/>
+          <w:szCs w:val="12"/>
+        </w:rPr>
+      </w:pPr>
+      <w:r>
+        <w:rPr>
+          <w:rFonts w:ascii="Big Caslon Medium" w:hAnsi="Big Caslon Medium" w:eastAsia="Big Caslon Medium" w:cs="Big Caslon Medium"/>
           <w:sz w:val="12"/>
           <w:szCs w:val="12"/>
         </w:rPr>
@@ -3270,14 +3270,14 @@
         <w:jc w:val="left"/>
         <w:widowControl w:val="0"/>
         <w:rPr>
-          <w:rFonts w:ascii="Big Caslon" w:hAnsi="Big Caslon" w:eastAsia="Big Caslon" w:cs="Big Caslon"/>
-          <w:sz w:val="12"/>
-          <w:szCs w:val="12"/>
-        </w:rPr>
-      </w:pPr>
-      <w:r>
-        <w:rPr>
-          <w:rFonts w:ascii="Big Caslon" w:hAnsi="Big Caslon" w:eastAsia="Big Caslon" w:cs="Big Caslon"/>
+          <w:rFonts w:ascii="Big Caslon Medium" w:hAnsi="Big Caslon Medium" w:eastAsia="Big Caslon Medium" w:cs="Big Caslon Medium"/>
+          <w:sz w:val="12"/>
+          <w:szCs w:val="12"/>
+        </w:rPr>
+      </w:pPr>
+      <w:r>
+        <w:rPr>
+          <w:rFonts w:ascii="Big Caslon Medium" w:hAnsi="Big Caslon Medium" w:eastAsia="Big Caslon Medium" w:cs="Big Caslon Medium"/>
           <w:sz w:val="12"/>
           <w:szCs w:val="12"/>
         </w:rPr>
@@ -3290,14 +3290,14 @@
         <w:jc w:val="left"/>
         <w:widowControl w:val="0"/>
         <w:rPr>
-          <w:rFonts w:ascii="Big Caslon" w:hAnsi="Big Caslon" w:eastAsia="Big Caslon" w:cs="Big Caslon"/>
-          <w:sz w:val="12"/>
-          <w:szCs w:val="12"/>
-        </w:rPr>
-      </w:pPr>
-      <w:r>
-        <w:rPr>
-          <w:rFonts w:ascii="Big Caslon" w:hAnsi="Big Caslon" w:eastAsia="Big Caslon" w:cs="Big Caslon"/>
+          <w:rFonts w:ascii="Big Caslon Medium" w:hAnsi="Big Caslon Medium" w:eastAsia="Big Caslon Medium" w:cs="Big Caslon Medium"/>
+          <w:sz w:val="12"/>
+          <w:szCs w:val="12"/>
+        </w:rPr>
+      </w:pPr>
+      <w:r>
+        <w:rPr>
+          <w:rFonts w:ascii="Big Caslon Medium" w:hAnsi="Big Caslon Medium" w:eastAsia="Big Caslon Medium" w:cs="Big Caslon Medium"/>
           <w:sz w:val="12"/>
           <w:szCs w:val="12"/>
         </w:rPr>
@@ -3310,14 +3310,14 @@
         <w:jc w:val="left"/>
         <w:widowControl w:val="0"/>
         <w:rPr>
-          <w:rFonts w:ascii="Big Caslon" w:hAnsi="Big Caslon" w:eastAsia="Big Caslon" w:cs="Big Caslon"/>
-          <w:sz w:val="12"/>
-          <w:szCs w:val="12"/>
-        </w:rPr>
-      </w:pPr>
-      <w:r>
-        <w:rPr>
-          <w:rFonts w:ascii="Big Caslon" w:hAnsi="Big Caslon" w:eastAsia="Big Caslon" w:cs="Big Caslon"/>
+          <w:rFonts w:ascii="Big Caslon Medium" w:hAnsi="Big Caslon Medium" w:eastAsia="Big Caslon Medium" w:cs="Big Caslon Medium"/>
+          <w:sz w:val="12"/>
+          <w:szCs w:val="12"/>
+        </w:rPr>
+      </w:pPr>
+      <w:r>
+        <w:rPr>
+          <w:rFonts w:ascii="Big Caslon Medium" w:hAnsi="Big Caslon Medium" w:eastAsia="Big Caslon Medium" w:cs="Big Caslon Medium"/>
           <w:sz w:val="12"/>
           <w:szCs w:val="12"/>
         </w:rPr>
@@ -3330,14 +3330,14 @@
         <w:jc w:val="left"/>
         <w:widowControl w:val="0"/>
         <w:rPr>
-          <w:rFonts w:ascii="Big Caslon" w:hAnsi="Big Caslon" w:eastAsia="Big Caslon" w:cs="Big Caslon"/>
-          <w:sz w:val="12"/>
-          <w:szCs w:val="12"/>
-        </w:rPr>
-      </w:pPr>
-      <w:r>
-        <w:rPr>
-          <w:rFonts w:ascii="Big Caslon" w:hAnsi="Big Caslon" w:eastAsia="Big Caslon" w:cs="Big Caslon"/>
+          <w:rFonts w:ascii="Big Caslon Medium" w:hAnsi="Big Caslon Medium" w:eastAsia="Big Caslon Medium" w:cs="Big Caslon Medium"/>
+          <w:sz w:val="12"/>
+          <w:szCs w:val="12"/>
+        </w:rPr>
+      </w:pPr>
+      <w:r>
+        <w:rPr>
+          <w:rFonts w:ascii="Big Caslon Medium" w:hAnsi="Big Caslon Medium" w:eastAsia="Big Caslon Medium" w:cs="Big Caslon Medium"/>
           <w:sz w:val="12"/>
           <w:szCs w:val="12"/>
         </w:rPr>
@@ -3350,14 +3350,14 @@
         <w:jc w:val="left"/>
         <w:widowControl w:val="0"/>
         <w:rPr>
-          <w:rFonts w:ascii="Big Caslon" w:hAnsi="Big Caslon" w:eastAsia="Big Caslon" w:cs="Big Caslon"/>
-          <w:sz w:val="12"/>
-          <w:szCs w:val="12"/>
-        </w:rPr>
-      </w:pPr>
-      <w:r>
-        <w:rPr>
-          <w:rFonts w:ascii="Big Caslon" w:hAnsi="Big Caslon" w:eastAsia="Big Caslon" w:cs="Big Caslon"/>
+          <w:rFonts w:ascii="Big Caslon Medium" w:hAnsi="Big Caslon Medium" w:eastAsia="Big Caslon Medium" w:cs="Big Caslon Medium"/>
+          <w:sz w:val="12"/>
+          <w:szCs w:val="12"/>
+        </w:rPr>
+      </w:pPr>
+      <w:r>
+        <w:rPr>
+          <w:rFonts w:ascii="Big Caslon Medium" w:hAnsi="Big Caslon Medium" w:eastAsia="Big Caslon Medium" w:cs="Big Caslon Medium"/>
           <w:sz w:val="12"/>
           <w:szCs w:val="12"/>
         </w:rPr>
@@ -3370,14 +3370,14 @@
         <w:jc w:val="left"/>
         <w:widowControl w:val="0"/>
         <w:rPr>
-          <w:rFonts w:ascii="Big Caslon" w:hAnsi="Big Caslon" w:eastAsia="Big Caslon" w:cs="Big Caslon"/>
-          <w:sz w:val="12"/>
-          <w:szCs w:val="12"/>
-        </w:rPr>
-      </w:pPr>
-      <w:r>
-        <w:rPr>
-          <w:rFonts w:ascii="Big Caslon" w:hAnsi="Big Caslon" w:eastAsia="Big Caslon" w:cs="Big Caslon"/>
+          <w:rFonts w:ascii="Big Caslon Medium" w:hAnsi="Big Caslon Medium" w:eastAsia="Big Caslon Medium" w:cs="Big Caslon Medium"/>
+          <w:sz w:val="12"/>
+          <w:szCs w:val="12"/>
+        </w:rPr>
+      </w:pPr>
+      <w:r>
+        <w:rPr>
+          <w:rFonts w:ascii="Big Caslon Medium" w:hAnsi="Big Caslon Medium" w:eastAsia="Big Caslon Medium" w:cs="Big Caslon Medium"/>
           <w:sz w:val="12"/>
           <w:szCs w:val="12"/>
         </w:rPr>
@@ -3390,14 +3390,14 @@
         <w:jc w:val="left"/>
         <w:widowControl w:val="0"/>
         <w:rPr>
-          <w:rFonts w:ascii="Big Caslon" w:hAnsi="Big Caslon" w:eastAsia="Big Caslon" w:cs="Big Caslon"/>
-          <w:sz w:val="12"/>
-          <w:szCs w:val="12"/>
-        </w:rPr>
-      </w:pPr>
-      <w:r>
-        <w:rPr>
-          <w:rFonts w:ascii="Big Caslon" w:hAnsi="Big Caslon" w:eastAsia="Big Caslon" w:cs="Big Caslon"/>
+          <w:rFonts w:ascii="Big Caslon Medium" w:hAnsi="Big Caslon Medium" w:eastAsia="Big Caslon Medium" w:cs="Big Caslon Medium"/>
+          <w:sz w:val="12"/>
+          <w:szCs w:val="12"/>
+        </w:rPr>
+      </w:pPr>
+      <w:r>
+        <w:rPr>
+          <w:rFonts w:ascii="Big Caslon Medium" w:hAnsi="Big Caslon Medium" w:eastAsia="Big Caslon Medium" w:cs="Big Caslon Medium"/>
           <w:sz w:val="12"/>
           <w:szCs w:val="12"/>
         </w:rPr>
@@ -3410,14 +3410,14 @@
         <w:jc w:val="left"/>
         <w:widowControl w:val="0"/>
         <w:rPr>
-          <w:rFonts w:ascii="Big Caslon" w:hAnsi="Big Caslon" w:eastAsia="Big Caslon" w:cs="Big Caslon"/>
-          <w:sz w:val="12"/>
-          <w:szCs w:val="12"/>
-        </w:rPr>
-      </w:pPr>
-      <w:r>
-        <w:rPr>
-          <w:rFonts w:ascii="Big Caslon" w:hAnsi="Big Caslon" w:eastAsia="Big Caslon" w:cs="Big Caslon"/>
+          <w:rFonts w:ascii="Big Caslon Medium" w:hAnsi="Big Caslon Medium" w:eastAsia="Big Caslon Medium" w:cs="Big Caslon Medium"/>
+          <w:sz w:val="12"/>
+          <w:szCs w:val="12"/>
+        </w:rPr>
+      </w:pPr>
+      <w:r>
+        <w:rPr>
+          <w:rFonts w:ascii="Big Caslon Medium" w:hAnsi="Big Caslon Medium" w:eastAsia="Big Caslon Medium" w:cs="Big Caslon Medium"/>
           <w:sz w:val="12"/>
           <w:szCs w:val="12"/>
         </w:rPr>
@@ -3430,14 +3430,14 @@
         <w:jc w:val="left"/>
         <w:widowControl w:val="0"/>
         <w:rPr>
-          <w:rFonts w:ascii="Big Caslon" w:hAnsi="Big Caslon" w:eastAsia="Big Caslon" w:cs="Big Caslon"/>
-          <w:sz w:val="12"/>
-          <w:szCs w:val="12"/>
-        </w:rPr>
-      </w:pPr>
-      <w:r>
-        <w:rPr>
-          <w:rFonts w:ascii="Big Caslon" w:hAnsi="Big Caslon" w:eastAsia="Big Caslon" w:cs="Big Caslon"/>
+          <w:rFonts w:ascii="Big Caslon Medium" w:hAnsi="Big Caslon Medium" w:eastAsia="Big Caslon Medium" w:cs="Big Caslon Medium"/>
+          <w:sz w:val="12"/>
+          <w:szCs w:val="12"/>
+        </w:rPr>
+      </w:pPr>
+      <w:r>
+        <w:rPr>
+          <w:rFonts w:ascii="Big Caslon Medium" w:hAnsi="Big Caslon Medium" w:eastAsia="Big Caslon Medium" w:cs="Big Caslon Medium"/>
           <w:sz w:val="12"/>
           <w:szCs w:val="12"/>
         </w:rPr>
@@ -3450,14 +3450,14 @@
         <w:jc w:val="left"/>
         <w:widowControl w:val="0"/>
         <w:rPr>
-          <w:rFonts w:ascii="Big Caslon" w:hAnsi="Big Caslon" w:eastAsia="Big Caslon" w:cs="Big Caslon"/>
-          <w:sz w:val="12"/>
-          <w:szCs w:val="12"/>
-        </w:rPr>
-      </w:pPr>
-      <w:r>
-        <w:rPr>
-          <w:rFonts w:ascii="Big Caslon" w:hAnsi="Big Caslon" w:eastAsia="Big Caslon" w:cs="Big Caslon"/>
+          <w:rFonts w:ascii="Big Caslon Medium" w:hAnsi="Big Caslon Medium" w:eastAsia="Big Caslon Medium" w:cs="Big Caslon Medium"/>
+          <w:sz w:val="12"/>
+          <w:szCs w:val="12"/>
+        </w:rPr>
+      </w:pPr>
+      <w:r>
+        <w:rPr>
+          <w:rFonts w:ascii="Big Caslon Medium" w:hAnsi="Big Caslon Medium" w:eastAsia="Big Caslon Medium" w:cs="Big Caslon Medium"/>
           <w:sz w:val="12"/>
           <w:szCs w:val="12"/>
         </w:rPr>
@@ -3470,14 +3470,14 @@
         <w:jc w:val="left"/>
         <w:widowControl w:val="0"/>
         <w:rPr>
-          <w:rFonts w:ascii="Big Caslon" w:hAnsi="Big Caslon" w:eastAsia="Big Caslon" w:cs="Big Caslon"/>
-          <w:sz w:val="12"/>
-          <w:szCs w:val="12"/>
-        </w:rPr>
-      </w:pPr>
-      <w:r>
-        <w:rPr>
-          <w:rFonts w:ascii="Big Caslon" w:hAnsi="Big Caslon" w:eastAsia="Big Caslon" w:cs="Big Caslon"/>
+          <w:rFonts w:ascii="Big Caslon Medium" w:hAnsi="Big Caslon Medium" w:eastAsia="Big Caslon Medium" w:cs="Big Caslon Medium"/>
+          <w:sz w:val="12"/>
+          <w:szCs w:val="12"/>
+        </w:rPr>
+      </w:pPr>
+      <w:r>
+        <w:rPr>
+          <w:rFonts w:ascii="Big Caslon Medium" w:hAnsi="Big Caslon Medium" w:eastAsia="Big Caslon Medium" w:cs="Big Caslon Medium"/>
           <w:sz w:val="12"/>
           <w:szCs w:val="12"/>
         </w:rPr>
@@ -3490,14 +3490,14 @@
         <w:jc w:val="left"/>
         <w:widowControl w:val="0"/>
         <w:rPr>
-          <w:rFonts w:ascii="Big Caslon" w:hAnsi="Big Caslon" w:eastAsia="Big Caslon" w:cs="Big Caslon"/>
-          <w:sz w:val="12"/>
-          <w:szCs w:val="12"/>
-        </w:rPr>
-      </w:pPr>
-      <w:r>
-        <w:rPr>
-          <w:rFonts w:ascii="Big Caslon" w:hAnsi="Big Caslon" w:eastAsia="Big Caslon" w:cs="Big Caslon"/>
+          <w:rFonts w:ascii="Big Caslon Medium" w:hAnsi="Big Caslon Medium" w:eastAsia="Big Caslon Medium" w:cs="Big Caslon Medium"/>
+          <w:sz w:val="12"/>
+          <w:szCs w:val="12"/>
+        </w:rPr>
+      </w:pPr>
+      <w:r>
+        <w:rPr>
+          <w:rFonts w:ascii="Big Caslon Medium" w:hAnsi="Big Caslon Medium" w:eastAsia="Big Caslon Medium" w:cs="Big Caslon Medium"/>
           <w:sz w:val="12"/>
           <w:szCs w:val="12"/>
         </w:rPr>
@@ -3510,14 +3510,14 @@
         <w:jc w:val="left"/>
         <w:widowControl w:val="0"/>
         <w:rPr>
-          <w:rFonts w:ascii="Big Caslon" w:hAnsi="Big Caslon" w:eastAsia="Big Caslon" w:cs="Big Caslon"/>
-          <w:sz w:val="12"/>
-          <w:szCs w:val="12"/>
-        </w:rPr>
-      </w:pPr>
-      <w:r>
-        <w:rPr>
-          <w:rFonts w:ascii="Big Caslon" w:hAnsi="Big Caslon" w:eastAsia="Big Caslon" w:cs="Big Caslon"/>
+          <w:rFonts w:ascii="Big Caslon Medium" w:hAnsi="Big Caslon Medium" w:eastAsia="Big Caslon Medium" w:cs="Big Caslon Medium"/>
+          <w:sz w:val="12"/>
+          <w:szCs w:val="12"/>
+        </w:rPr>
+      </w:pPr>
+      <w:r>
+        <w:rPr>
+          <w:rFonts w:ascii="Big Caslon Medium" w:hAnsi="Big Caslon Medium" w:eastAsia="Big Caslon Medium" w:cs="Big Caslon Medium"/>
           <w:sz w:val="12"/>
           <w:szCs w:val="12"/>
         </w:rPr>
@@ -3530,14 +3530,14 @@
         <w:jc w:val="left"/>
         <w:widowControl w:val="0"/>
         <w:rPr>
-          <w:rFonts w:ascii="Big Caslon" w:hAnsi="Big Caslon" w:eastAsia="Big Caslon" w:cs="Big Caslon"/>
-          <w:sz w:val="12"/>
-          <w:szCs w:val="12"/>
-        </w:rPr>
-      </w:pPr>
-      <w:r>
-        <w:rPr>
-          <w:rFonts w:ascii="Big Caslon" w:hAnsi="Big Caslon" w:eastAsia="Big Caslon" w:cs="Big Caslon"/>
+          <w:rFonts w:ascii="Big Caslon Medium" w:hAnsi="Big Caslon Medium" w:eastAsia="Big Caslon Medium" w:cs="Big Caslon Medium"/>
+          <w:sz w:val="12"/>
+          <w:szCs w:val="12"/>
+        </w:rPr>
+      </w:pPr>
+      <w:r>
+        <w:rPr>
+          <w:rFonts w:ascii="Big Caslon Medium" w:hAnsi="Big Caslon Medium" w:eastAsia="Big Caslon Medium" w:cs="Big Caslon Medium"/>
           <w:sz w:val="12"/>
           <w:szCs w:val="12"/>
         </w:rPr>
@@ -3550,14 +3550,14 @@
         <w:jc w:val="left"/>
         <w:widowControl w:val="0"/>
         <w:rPr>
-          <w:rFonts w:ascii="Big Caslon" w:hAnsi="Big Caslon" w:eastAsia="Big Caslon" w:cs="Big Caslon"/>
-          <w:sz w:val="12"/>
-          <w:szCs w:val="12"/>
-        </w:rPr>
-      </w:pPr>
-      <w:r>
-        <w:rPr>
-          <w:rFonts w:ascii="Big Caslon" w:hAnsi="Big Caslon" w:eastAsia="Big Caslon" w:cs="Big Caslon"/>
+          <w:rFonts w:ascii="Big Caslon Medium" w:hAnsi="Big Caslon Medium" w:eastAsia="Big Caslon Medium" w:cs="Big Caslon Medium"/>
+          <w:sz w:val="12"/>
+          <w:szCs w:val="12"/>
+        </w:rPr>
+      </w:pPr>
+      <w:r>
+        <w:rPr>
+          <w:rFonts w:ascii="Big Caslon Medium" w:hAnsi="Big Caslon Medium" w:eastAsia="Big Caslon Medium" w:cs="Big Caslon Medium"/>
           <w:sz w:val="12"/>
           <w:szCs w:val="12"/>
         </w:rPr>
@@ -3570,14 +3570,14 @@
         <w:jc w:val="left"/>
         <w:widowControl w:val="0"/>
         <w:rPr>
-          <w:rFonts w:ascii="Big Caslon" w:hAnsi="Big Caslon" w:eastAsia="Big Caslon" w:cs="Big Caslon"/>
-          <w:sz w:val="12"/>
-          <w:szCs w:val="12"/>
-        </w:rPr>
-      </w:pPr>
-      <w:r>
-        <w:rPr>
-          <w:rFonts w:ascii="Big Caslon" w:hAnsi="Big Caslon" w:eastAsia="Big Caslon" w:cs="Big Caslon"/>
+          <w:rFonts w:ascii="Big Caslon Medium" w:hAnsi="Big Caslon Medium" w:eastAsia="Big Caslon Medium" w:cs="Big Caslon Medium"/>
+          <w:sz w:val="12"/>
+          <w:szCs w:val="12"/>
+        </w:rPr>
+      </w:pPr>
+      <w:r>
+        <w:rPr>
+          <w:rFonts w:ascii="Big Caslon Medium" w:hAnsi="Big Caslon Medium" w:eastAsia="Big Caslon Medium" w:cs="Big Caslon Medium"/>
           <w:sz w:val="12"/>
           <w:szCs w:val="12"/>
         </w:rPr>
@@ -3590,14 +3590,14 @@
         <w:jc w:val="left"/>
         <w:widowControl w:val="0"/>
         <w:rPr>
-          <w:rFonts w:ascii="Big Caslon" w:hAnsi="Big Caslon" w:eastAsia="Big Caslon" w:cs="Big Caslon"/>
-          <w:sz w:val="12"/>
-          <w:szCs w:val="12"/>
-        </w:rPr>
-      </w:pPr>
-      <w:r>
-        <w:rPr>
-          <w:rFonts w:ascii="Big Caslon" w:hAnsi="Big Caslon" w:eastAsia="Big Caslon" w:cs="Big Caslon"/>
+          <w:rFonts w:ascii="Big Caslon Medium" w:hAnsi="Big Caslon Medium" w:eastAsia="Big Caslon Medium" w:cs="Big Caslon Medium"/>
+          <w:sz w:val="12"/>
+          <w:szCs w:val="12"/>
+        </w:rPr>
+      </w:pPr>
+      <w:r>
+        <w:rPr>
+          <w:rFonts w:ascii="Big Caslon Medium" w:hAnsi="Big Caslon Medium" w:eastAsia="Big Caslon Medium" w:cs="Big Caslon Medium"/>
           <w:sz w:val="12"/>
           <w:szCs w:val="12"/>
         </w:rPr>
@@ -3610,14 +3610,14 @@
         <w:jc w:val="left"/>
         <w:widowControl w:val="0"/>
         <w:rPr>
-          <w:rFonts w:ascii="Big Caslon" w:hAnsi="Big Caslon" w:eastAsia="Big Caslon" w:cs="Big Caslon"/>
-          <w:sz w:val="12"/>
-          <w:szCs w:val="12"/>
-        </w:rPr>
-      </w:pPr>
-      <w:r>
-        <w:rPr>
-          <w:rFonts w:ascii="Big Caslon" w:hAnsi="Big Caslon" w:eastAsia="Big Caslon" w:cs="Big Caslon"/>
+          <w:rFonts w:ascii="Big Caslon Medium" w:hAnsi="Big Caslon Medium" w:eastAsia="Big Caslon Medium" w:cs="Big Caslon Medium"/>
+          <w:sz w:val="12"/>
+          <w:szCs w:val="12"/>
+        </w:rPr>
+      </w:pPr>
+      <w:r>
+        <w:rPr>
+          <w:rFonts w:ascii="Big Caslon Medium" w:hAnsi="Big Caslon Medium" w:eastAsia="Big Caslon Medium" w:cs="Big Caslon Medium"/>
           <w:sz w:val="12"/>
           <w:szCs w:val="12"/>
         </w:rPr>
@@ -3630,14 +3630,14 @@
         <w:jc w:val="left"/>
         <w:widowControl w:val="0"/>
         <w:rPr>
-          <w:rFonts w:ascii="Big Caslon" w:hAnsi="Big Caslon" w:eastAsia="Big Caslon" w:cs="Big Caslon"/>
-          <w:sz w:val="12"/>
-          <w:szCs w:val="12"/>
-        </w:rPr>
-      </w:pPr>
-      <w:r>
-        <w:rPr>
-          <w:rFonts w:ascii="Big Caslon" w:hAnsi="Big Caslon" w:eastAsia="Big Caslon" w:cs="Big Caslon"/>
+          <w:rFonts w:ascii="Big Caslon Medium" w:hAnsi="Big Caslon Medium" w:eastAsia="Big Caslon Medium" w:cs="Big Caslon Medium"/>
+          <w:sz w:val="12"/>
+          <w:szCs w:val="12"/>
+        </w:rPr>
+      </w:pPr>
+      <w:r>
+        <w:rPr>
+          <w:rFonts w:ascii="Big Caslon Medium" w:hAnsi="Big Caslon Medium" w:eastAsia="Big Caslon Medium" w:cs="Big Caslon Medium"/>
           <w:sz w:val="12"/>
           <w:szCs w:val="12"/>
         </w:rPr>
@@ -3650,14 +3650,14 @@
         <w:jc w:val="left"/>
         <w:widowControl w:val="0"/>
         <w:rPr>
-          <w:rFonts w:ascii="Big Caslon" w:hAnsi="Big Caslon" w:eastAsia="Big Caslon" w:cs="Big Caslon"/>
-          <w:sz w:val="12"/>
-          <w:szCs w:val="12"/>
-        </w:rPr>
-      </w:pPr>
-      <w:r>
-        <w:rPr>
-          <w:rFonts w:ascii="Big Caslon" w:hAnsi="Big Caslon" w:eastAsia="Big Caslon" w:cs="Big Caslon"/>
+          <w:rFonts w:ascii="Big Caslon Medium" w:hAnsi="Big Caslon Medium" w:eastAsia="Big Caslon Medium" w:cs="Big Caslon Medium"/>
+          <w:sz w:val="12"/>
+          <w:szCs w:val="12"/>
+        </w:rPr>
+      </w:pPr>
+      <w:r>
+        <w:rPr>
+          <w:rFonts w:ascii="Big Caslon Medium" w:hAnsi="Big Caslon Medium" w:eastAsia="Big Caslon Medium" w:cs="Big Caslon Medium"/>
           <w:sz w:val="12"/>
           <w:szCs w:val="12"/>
         </w:rPr>
@@ -3670,14 +3670,14 @@
         <w:jc w:val="left"/>
         <w:widowControl w:val="0"/>
         <w:rPr>
-          <w:rFonts w:ascii="Big Caslon" w:hAnsi="Big Caslon" w:eastAsia="Big Caslon" w:cs="Big Caslon"/>
-          <w:sz w:val="12"/>
-          <w:szCs w:val="12"/>
-        </w:rPr>
-      </w:pPr>
-      <w:r>
-        <w:rPr>
-          <w:rFonts w:ascii="Big Caslon" w:hAnsi="Big Caslon" w:eastAsia="Big Caslon" w:cs="Big Caslon"/>
+          <w:rFonts w:ascii="Big Caslon Medium" w:hAnsi="Big Caslon Medium" w:eastAsia="Big Caslon Medium" w:cs="Big Caslon Medium"/>
+          <w:sz w:val="12"/>
+          <w:szCs w:val="12"/>
+        </w:rPr>
+      </w:pPr>
+      <w:r>
+        <w:rPr>
+          <w:rFonts w:ascii="Big Caslon Medium" w:hAnsi="Big Caslon Medium" w:eastAsia="Big Caslon Medium" w:cs="Big Caslon Medium"/>
           <w:sz w:val="12"/>
           <w:szCs w:val="12"/>
         </w:rPr>
@@ -3690,14 +3690,14 @@
         <w:jc w:val="left"/>
         <w:widowControl w:val="0"/>
         <w:rPr>
-          <w:rFonts w:ascii="Big Caslon" w:hAnsi="Big Caslon" w:eastAsia="Big Caslon" w:cs="Big Caslon"/>
-          <w:sz w:val="12"/>
-          <w:szCs w:val="12"/>
-        </w:rPr>
-      </w:pPr>
-      <w:r>
-        <w:rPr>
-          <w:rFonts w:ascii="Big Caslon" w:hAnsi="Big Caslon" w:eastAsia="Big Caslon" w:cs="Big Caslon"/>
+          <w:rFonts w:ascii="Big Caslon Medium" w:hAnsi="Big Caslon Medium" w:eastAsia="Big Caslon Medium" w:cs="Big Caslon Medium"/>
+          <w:sz w:val="12"/>
+          <w:szCs w:val="12"/>
+        </w:rPr>
+      </w:pPr>
+      <w:r>
+        <w:rPr>
+          <w:rFonts w:ascii="Big Caslon Medium" w:hAnsi="Big Caslon Medium" w:eastAsia="Big Caslon Medium" w:cs="Big Caslon Medium"/>
           <w:sz w:val="12"/>
           <w:szCs w:val="12"/>
         </w:rPr>
@@ -3710,14 +3710,14 @@
         <w:jc w:val="left"/>
         <w:widowControl w:val="0"/>
         <w:rPr>
-          <w:rFonts w:ascii="Big Caslon" w:hAnsi="Big Caslon" w:eastAsia="Big Caslon" w:cs="Big Caslon"/>
-          <w:sz w:val="12"/>
-          <w:szCs w:val="12"/>
-        </w:rPr>
-      </w:pPr>
-      <w:r>
-        <w:rPr>
-          <w:rFonts w:ascii="Big Caslon" w:hAnsi="Big Caslon" w:eastAsia="Big Caslon" w:cs="Big Caslon"/>
+          <w:rFonts w:ascii="Big Caslon Medium" w:hAnsi="Big Caslon Medium" w:eastAsia="Big Caslon Medium" w:cs="Big Caslon Medium"/>
+          <w:sz w:val="12"/>
+          <w:szCs w:val="12"/>
+        </w:rPr>
+      </w:pPr>
+      <w:r>
+        <w:rPr>
+          <w:rFonts w:ascii="Big Caslon Medium" w:hAnsi="Big Caslon Medium" w:eastAsia="Big Caslon Medium" w:cs="Big Caslon Medium"/>
           <w:sz w:val="12"/>
           <w:szCs w:val="12"/>
         </w:rPr>
@@ -3730,14 +3730,14 @@
         <w:jc w:val="left"/>
         <w:widowControl w:val="0"/>
         <w:rPr>
-          <w:rFonts w:ascii="Big Caslon" w:hAnsi="Big Caslon" w:eastAsia="Big Caslon" w:cs="Big Caslon"/>
-          <w:sz w:val="12"/>
-          <w:szCs w:val="12"/>
-        </w:rPr>
-      </w:pPr>
-      <w:r>
-        <w:rPr>
-          <w:rFonts w:ascii="Big Caslon" w:hAnsi="Big Caslon" w:eastAsia="Big Caslon" w:cs="Big Caslon"/>
+          <w:rFonts w:ascii="Big Caslon Medium" w:hAnsi="Big Caslon Medium" w:eastAsia="Big Caslon Medium" w:cs="Big Caslon Medium"/>
+          <w:sz w:val="12"/>
+          <w:szCs w:val="12"/>
+        </w:rPr>
+      </w:pPr>
+      <w:r>
+        <w:rPr>
+          <w:rFonts w:ascii="Big Caslon Medium" w:hAnsi="Big Caslon Medium" w:eastAsia="Big Caslon Medium" w:cs="Big Caslon Medium"/>
           <w:sz w:val="12"/>
           <w:szCs w:val="12"/>
         </w:rPr>
@@ -3750,14 +3750,14 @@
         <w:jc w:val="left"/>
         <w:widowControl w:val="0"/>
         <w:rPr>
-          <w:rFonts w:ascii="Big Caslon" w:hAnsi="Big Caslon" w:eastAsia="Big Caslon" w:cs="Big Caslon"/>
-          <w:sz w:val="12"/>
-          <w:szCs w:val="12"/>
-        </w:rPr>
-      </w:pPr>
-      <w:r>
-        <w:rPr>
-          <w:rFonts w:ascii="Big Caslon" w:hAnsi="Big Caslon" w:eastAsia="Big Caslon" w:cs="Big Caslon"/>
+          <w:rFonts w:ascii="Big Caslon Medium" w:hAnsi="Big Caslon Medium" w:eastAsia="Big Caslon Medium" w:cs="Big Caslon Medium"/>
+          <w:sz w:val="12"/>
+          <w:szCs w:val="12"/>
+        </w:rPr>
+      </w:pPr>
+      <w:r>
+        <w:rPr>
+          <w:rFonts w:ascii="Big Caslon Medium" w:hAnsi="Big Caslon Medium" w:eastAsia="Big Caslon Medium" w:cs="Big Caslon Medium"/>
           <w:sz w:val="12"/>
           <w:szCs w:val="12"/>
         </w:rPr>
@@ -3770,14 +3770,14 @@
         <w:jc w:val="left"/>
         <w:widowControl w:val="0"/>
         <w:rPr>
-          <w:rFonts w:ascii="Big Caslon" w:hAnsi="Big Caslon" w:eastAsia="Big Caslon" w:cs="Big Caslon"/>
-          <w:sz w:val="12"/>
-          <w:szCs w:val="12"/>
-        </w:rPr>
-      </w:pPr>
-      <w:r>
-        <w:rPr>
-          <w:rFonts w:ascii="Big Caslon" w:hAnsi="Big Caslon" w:eastAsia="Big Caslon" w:cs="Big Caslon"/>
+          <w:rFonts w:ascii="Big Caslon Medium" w:hAnsi="Big Caslon Medium" w:eastAsia="Big Caslon Medium" w:cs="Big Caslon Medium"/>
+          <w:sz w:val="12"/>
+          <w:szCs w:val="12"/>
+        </w:rPr>
+      </w:pPr>
+      <w:r>
+        <w:rPr>
+          <w:rFonts w:ascii="Big Caslon Medium" w:hAnsi="Big Caslon Medium" w:eastAsia="Big Caslon Medium" w:cs="Big Caslon Medium"/>
           <w:sz w:val="12"/>
           <w:szCs w:val="12"/>
         </w:rPr>
@@ -3790,14 +3790,14 @@
         <w:jc w:val="left"/>
         <w:widowControl w:val="0"/>
         <w:rPr>
-          <w:rFonts w:ascii="Big Caslon" w:hAnsi="Big Caslon" w:eastAsia="Big Caslon" w:cs="Big Caslon"/>
-          <w:sz w:val="12"/>
-          <w:szCs w:val="12"/>
-        </w:rPr>
-      </w:pPr>
-      <w:r>
-        <w:rPr>
-          <w:rFonts w:ascii="Big Caslon" w:hAnsi="Big Caslon" w:eastAsia="Big Caslon" w:cs="Big Caslon"/>
+          <w:rFonts w:ascii="Big Caslon Medium" w:hAnsi="Big Caslon Medium" w:eastAsia="Big Caslon Medium" w:cs="Big Caslon Medium"/>
+          <w:sz w:val="12"/>
+          <w:szCs w:val="12"/>
+        </w:rPr>
+      </w:pPr>
+      <w:r>
+        <w:rPr>
+          <w:rFonts w:ascii="Big Caslon Medium" w:hAnsi="Big Caslon Medium" w:eastAsia="Big Caslon Medium" w:cs="Big Caslon Medium"/>
           <w:sz w:val="12"/>
           <w:szCs w:val="12"/>
         </w:rPr>
@@ -3810,14 +3810,14 @@
         <w:jc w:val="left"/>
         <w:widowControl w:val="0"/>
         <w:rPr>
-          <w:rFonts w:ascii="Big Caslon" w:hAnsi="Big Caslon" w:eastAsia="Big Caslon" w:cs="Big Caslon"/>
-          <w:sz w:val="12"/>
-          <w:szCs w:val="12"/>
-        </w:rPr>
-      </w:pPr>
-      <w:r>
-        <w:rPr>
-          <w:rFonts w:ascii="Big Caslon" w:hAnsi="Big Caslon" w:eastAsia="Big Caslon" w:cs="Big Caslon"/>
+          <w:rFonts w:ascii="Big Caslon Medium" w:hAnsi="Big Caslon Medium" w:eastAsia="Big Caslon Medium" w:cs="Big Caslon Medium"/>
+          <w:sz w:val="12"/>
+          <w:szCs w:val="12"/>
+        </w:rPr>
+      </w:pPr>
+      <w:r>
+        <w:rPr>
+          <w:rFonts w:ascii="Big Caslon Medium" w:hAnsi="Big Caslon Medium" w:eastAsia="Big Caslon Medium" w:cs="Big Caslon Medium"/>
           <w:sz w:val="12"/>
           <w:szCs w:val="12"/>
         </w:rPr>
@@ -3830,14 +3830,14 @@
         <w:jc w:val="left"/>
         <w:widowControl w:val="0"/>
         <w:rPr>
-          <w:rFonts w:ascii="Big Caslon" w:hAnsi="Big Caslon" w:eastAsia="Big Caslon" w:cs="Big Caslon"/>
-          <w:sz w:val="12"/>
-          <w:szCs w:val="12"/>
-        </w:rPr>
-      </w:pPr>
-      <w:r>
-        <w:rPr>
-          <w:rFonts w:ascii="Big Caslon" w:hAnsi="Big Caslon" w:eastAsia="Big Caslon" w:cs="Big Caslon"/>
+          <w:rFonts w:ascii="Big Caslon Medium" w:hAnsi="Big Caslon Medium" w:eastAsia="Big Caslon Medium" w:cs="Big Caslon Medium"/>
+          <w:sz w:val="12"/>
+          <w:szCs w:val="12"/>
+        </w:rPr>
+      </w:pPr>
+      <w:r>
+        <w:rPr>
+          <w:rFonts w:ascii="Big Caslon Medium" w:hAnsi="Big Caslon Medium" w:eastAsia="Big Caslon Medium" w:cs="Big Caslon Medium"/>
           <w:sz w:val="12"/>
           <w:szCs w:val="12"/>
         </w:rPr>
@@ -3850,14 +3850,14 @@
         <w:jc w:val="left"/>
         <w:widowControl w:val="0"/>
         <w:rPr>
-          <w:rFonts w:ascii="Big Caslon" w:hAnsi="Big Caslon" w:eastAsia="Big Caslon" w:cs="Big Caslon"/>
-          <w:sz w:val="12"/>
-          <w:szCs w:val="12"/>
-        </w:rPr>
-      </w:pPr>
-      <w:r>
-        <w:rPr>
-          <w:rFonts w:ascii="Big Caslon" w:hAnsi="Big Caslon" w:eastAsia="Big Caslon" w:cs="Big Caslon"/>
+          <w:rFonts w:ascii="Big Caslon Medium" w:hAnsi="Big Caslon Medium" w:eastAsia="Big Caslon Medium" w:cs="Big Caslon Medium"/>
+          <w:sz w:val="12"/>
+          <w:szCs w:val="12"/>
+        </w:rPr>
+      </w:pPr>
+      <w:r>
+        <w:rPr>
+          <w:rFonts w:ascii="Big Caslon Medium" w:hAnsi="Big Caslon Medium" w:eastAsia="Big Caslon Medium" w:cs="Big Caslon Medium"/>
           <w:sz w:val="12"/>
           <w:szCs w:val="12"/>
         </w:rPr>
@@ -3870,14 +3870,14 @@
         <w:jc w:val="left"/>
         <w:widowControl w:val="0"/>
         <w:rPr>
-          <w:rFonts w:ascii="Big Caslon" w:hAnsi="Big Caslon" w:eastAsia="Big Caslon" w:cs="Big Caslon"/>
-          <w:sz w:val="12"/>
-          <w:szCs w:val="12"/>
-        </w:rPr>
-      </w:pPr>
-      <w:r>
-        <w:rPr>
-          <w:rFonts w:ascii="Big Caslon" w:hAnsi="Big Caslon" w:eastAsia="Big Caslon" w:cs="Big Caslon"/>
+          <w:rFonts w:ascii="Big Caslon Medium" w:hAnsi="Big Caslon Medium" w:eastAsia="Big Caslon Medium" w:cs="Big Caslon Medium"/>
+          <w:sz w:val="12"/>
+          <w:szCs w:val="12"/>
+        </w:rPr>
+      </w:pPr>
+      <w:r>
+        <w:rPr>
+          <w:rFonts w:ascii="Big Caslon Medium" w:hAnsi="Big Caslon Medium" w:eastAsia="Big Caslon Medium" w:cs="Big Caslon Medium"/>
           <w:sz w:val="12"/>
           <w:szCs w:val="12"/>
         </w:rPr>
@@ -3890,14 +3890,14 @@
         <w:jc w:val="left"/>
         <w:widowControl w:val="0"/>
         <w:rPr>
-          <w:rFonts w:ascii="Big Caslon" w:hAnsi="Big Caslon" w:eastAsia="Big Caslon" w:cs="Big Caslon"/>
-          <w:sz w:val="12"/>
-          <w:szCs w:val="12"/>
-        </w:rPr>
-      </w:pPr>
-      <w:r>
-        <w:rPr>
-          <w:rFonts w:ascii="Big Caslon" w:hAnsi="Big Caslon" w:eastAsia="Big Caslon" w:cs="Big Caslon"/>
+          <w:rFonts w:ascii="Big Caslon Medium" w:hAnsi="Big Caslon Medium" w:eastAsia="Big Caslon Medium" w:cs="Big Caslon Medium"/>
+          <w:sz w:val="12"/>
+          <w:szCs w:val="12"/>
+        </w:rPr>
+      </w:pPr>
+      <w:r>
+        <w:rPr>
+          <w:rFonts w:ascii="Big Caslon Medium" w:hAnsi="Big Caslon Medium" w:eastAsia="Big Caslon Medium" w:cs="Big Caslon Medium"/>
           <w:sz w:val="12"/>
           <w:szCs w:val="12"/>
         </w:rPr>
@@ -3910,14 +3910,14 @@
         <w:jc w:val="left"/>
         <w:widowControl w:val="0"/>
         <w:rPr>
-          <w:rFonts w:ascii="Big Caslon" w:hAnsi="Big Caslon" w:eastAsia="Big Caslon" w:cs="Big Caslon"/>
-          <w:sz w:val="12"/>
-          <w:szCs w:val="12"/>
-        </w:rPr>
-      </w:pPr>
-      <w:r>
-        <w:rPr>
-          <w:rFonts w:ascii="Big Caslon" w:hAnsi="Big Caslon" w:eastAsia="Big Caslon" w:cs="Big Caslon"/>
+          <w:rFonts w:ascii="Big Caslon Medium" w:hAnsi="Big Caslon Medium" w:eastAsia="Big Caslon Medium" w:cs="Big Caslon Medium"/>
+          <w:sz w:val="12"/>
+          <w:szCs w:val="12"/>
+        </w:rPr>
+      </w:pPr>
+      <w:r>
+        <w:rPr>
+          <w:rFonts w:ascii="Big Caslon Medium" w:hAnsi="Big Caslon Medium" w:eastAsia="Big Caslon Medium" w:cs="Big Caslon Medium"/>
           <w:sz w:val="12"/>
           <w:szCs w:val="12"/>
         </w:rPr>
@@ -3930,14 +3930,14 @@
         <w:jc w:val="left"/>
         <w:widowControl w:val="0"/>
         <w:rPr>
-          <w:rFonts w:ascii="Big Caslon" w:hAnsi="Big Caslon" w:eastAsia="Big Caslon" w:cs="Big Caslon"/>
-          <w:sz w:val="12"/>
-          <w:szCs w:val="12"/>
-        </w:rPr>
-      </w:pPr>
-      <w:r>
-        <w:rPr>
-          <w:rFonts w:ascii="Big Caslon" w:hAnsi="Big Caslon" w:eastAsia="Big Caslon" w:cs="Big Caslon"/>
+          <w:rFonts w:ascii="Big Caslon Medium" w:hAnsi="Big Caslon Medium" w:eastAsia="Big Caslon Medium" w:cs="Big Caslon Medium"/>
+          <w:sz w:val="12"/>
+          <w:szCs w:val="12"/>
+        </w:rPr>
+      </w:pPr>
+      <w:r>
+        <w:rPr>
+          <w:rFonts w:ascii="Big Caslon Medium" w:hAnsi="Big Caslon Medium" w:eastAsia="Big Caslon Medium" w:cs="Big Caslon Medium"/>
           <w:sz w:val="12"/>
           <w:szCs w:val="12"/>
         </w:rPr>
@@ -3950,14 +3950,14 @@
         <w:jc w:val="left"/>
         <w:widowControl w:val="0"/>
         <w:rPr>
-          <w:rFonts w:ascii="Big Caslon" w:hAnsi="Big Caslon" w:eastAsia="Big Caslon" w:cs="Big Caslon"/>
-          <w:sz w:val="12"/>
-          <w:szCs w:val="12"/>
-        </w:rPr>
-      </w:pPr>
-      <w:r>
-        <w:rPr>
-          <w:rFonts w:ascii="Big Caslon" w:hAnsi="Big Caslon" w:eastAsia="Big Caslon" w:cs="Big Caslon"/>
+          <w:rFonts w:ascii="Big Caslon Medium" w:hAnsi="Big Caslon Medium" w:eastAsia="Big Caslon Medium" w:cs="Big Caslon Medium"/>
+          <w:sz w:val="12"/>
+          <w:szCs w:val="12"/>
+        </w:rPr>
+      </w:pPr>
+      <w:r>
+        <w:rPr>
+          <w:rFonts w:ascii="Big Caslon Medium" w:hAnsi="Big Caslon Medium" w:eastAsia="Big Caslon Medium" w:cs="Big Caslon Medium"/>
           <w:sz w:val="12"/>
           <w:szCs w:val="12"/>
         </w:rPr>
@@ -3970,14 +3970,14 @@
         <w:jc w:val="left"/>
         <w:widowControl w:val="0"/>
         <w:rPr>
-          <w:rFonts w:ascii="Big Caslon" w:hAnsi="Big Caslon" w:eastAsia="Big Caslon" w:cs="Big Caslon"/>
-          <w:sz w:val="12"/>
-          <w:szCs w:val="12"/>
-        </w:rPr>
-      </w:pPr>
-      <w:r>
-        <w:rPr>
-          <w:rFonts w:ascii="Big Caslon" w:hAnsi="Big Caslon" w:eastAsia="Big Caslon" w:cs="Big Caslon"/>
+          <w:rFonts w:ascii="Big Caslon Medium" w:hAnsi="Big Caslon Medium" w:eastAsia="Big Caslon Medium" w:cs="Big Caslon Medium"/>
+          <w:sz w:val="12"/>
+          <w:szCs w:val="12"/>
+        </w:rPr>
+      </w:pPr>
+      <w:r>
+        <w:rPr>
+          <w:rFonts w:ascii="Big Caslon Medium" w:hAnsi="Big Caslon Medium" w:eastAsia="Big Caslon Medium" w:cs="Big Caslon Medium"/>
           <w:sz w:val="12"/>
           <w:szCs w:val="12"/>
         </w:rPr>
@@ -3990,14 +3990,14 @@
         <w:jc w:val="left"/>
         <w:widowControl w:val="0"/>
         <w:rPr>
-          <w:rFonts w:ascii="Big Caslon" w:hAnsi="Big Caslon" w:eastAsia="Big Caslon" w:cs="Big Caslon"/>
-          <w:sz w:val="12"/>
-          <w:szCs w:val="12"/>
-        </w:rPr>
-      </w:pPr>
-      <w:r>
-        <w:rPr>
-          <w:rFonts w:ascii="Big Caslon" w:hAnsi="Big Caslon" w:eastAsia="Big Caslon" w:cs="Big Caslon"/>
+          <w:rFonts w:ascii="Big Caslon Medium" w:hAnsi="Big Caslon Medium" w:eastAsia="Big Caslon Medium" w:cs="Big Caslon Medium"/>
+          <w:sz w:val="12"/>
+          <w:szCs w:val="12"/>
+        </w:rPr>
+      </w:pPr>
+      <w:r>
+        <w:rPr>
+          <w:rFonts w:ascii="Big Caslon Medium" w:hAnsi="Big Caslon Medium" w:eastAsia="Big Caslon Medium" w:cs="Big Caslon Medium"/>
           <w:sz w:val="12"/>
           <w:szCs w:val="12"/>
         </w:rPr>
@@ -4010,14 +4010,14 @@
         <w:jc w:val="left"/>
         <w:widowControl w:val="0"/>
         <w:rPr>
-          <w:rFonts w:ascii="Big Caslon" w:hAnsi="Big Caslon" w:eastAsia="Big Caslon" w:cs="Big Caslon"/>
-          <w:sz w:val="12"/>
-          <w:szCs w:val="12"/>
-        </w:rPr>
-      </w:pPr>
-      <w:r>
-        <w:rPr>
-          <w:rFonts w:ascii="Big Caslon" w:hAnsi="Big Caslon" w:eastAsia="Big Caslon" w:cs="Big Caslon"/>
+          <w:rFonts w:ascii="Big Caslon Medium" w:hAnsi="Big Caslon Medium" w:eastAsia="Big Caslon Medium" w:cs="Big Caslon Medium"/>
+          <w:sz w:val="12"/>
+          <w:szCs w:val="12"/>
+        </w:rPr>
+      </w:pPr>
+      <w:r>
+        <w:rPr>
+          <w:rFonts w:ascii="Big Caslon Medium" w:hAnsi="Big Caslon Medium" w:eastAsia="Big Caslon Medium" w:cs="Big Caslon Medium"/>
           <w:sz w:val="12"/>
           <w:szCs w:val="12"/>
         </w:rPr>
@@ -4030,14 +4030,14 @@
         <w:jc w:val="left"/>
         <w:widowControl w:val="0"/>
         <w:rPr>
-          <w:rFonts w:ascii="Big Caslon" w:hAnsi="Big Caslon" w:eastAsia="Big Caslon" w:cs="Big Caslon"/>
-          <w:sz w:val="12"/>
-          <w:szCs w:val="12"/>
-        </w:rPr>
-      </w:pPr>
-      <w:r>
-        <w:rPr>
-          <w:rFonts w:ascii="Big Caslon" w:hAnsi="Big Caslon" w:eastAsia="Big Caslon" w:cs="Big Caslon"/>
+          <w:rFonts w:ascii="Big Caslon Medium" w:hAnsi="Big Caslon Medium" w:eastAsia="Big Caslon Medium" w:cs="Big Caslon Medium"/>
+          <w:sz w:val="12"/>
+          <w:szCs w:val="12"/>
+        </w:rPr>
+      </w:pPr>
+      <w:r>
+        <w:rPr>
+          <w:rFonts w:ascii="Big Caslon Medium" w:hAnsi="Big Caslon Medium" w:eastAsia="Big Caslon Medium" w:cs="Big Caslon Medium"/>
           <w:sz w:val="12"/>
           <w:szCs w:val="12"/>
         </w:rPr>
@@ -4050,14 +4050,14 @@
         <w:jc w:val="left"/>
         <w:widowControl w:val="0"/>
         <w:rPr>
-          <w:rFonts w:ascii="Big Caslon" w:hAnsi="Big Caslon" w:eastAsia="Big Caslon" w:cs="Big Caslon"/>
-          <w:sz w:val="12"/>
-          <w:szCs w:val="12"/>
-        </w:rPr>
-      </w:pPr>
-      <w:r>
-        <w:rPr>
-          <w:rFonts w:ascii="Big Caslon" w:hAnsi="Big Caslon" w:eastAsia="Big Caslon" w:cs="Big Caslon"/>
+          <w:rFonts w:ascii="Big Caslon Medium" w:hAnsi="Big Caslon Medium" w:eastAsia="Big Caslon Medium" w:cs="Big Caslon Medium"/>
+          <w:sz w:val="12"/>
+          <w:szCs w:val="12"/>
+        </w:rPr>
+      </w:pPr>
+      <w:r>
+        <w:rPr>
+          <w:rFonts w:ascii="Big Caslon Medium" w:hAnsi="Big Caslon Medium" w:eastAsia="Big Caslon Medium" w:cs="Big Caslon Medium"/>
           <w:sz w:val="12"/>
           <w:szCs w:val="12"/>
         </w:rPr>
@@ -4070,14 +4070,14 @@
         <w:jc w:val="left"/>
         <w:widowControl w:val="0"/>
         <w:rPr>
-          <w:rFonts w:ascii="Big Caslon" w:hAnsi="Big Caslon" w:eastAsia="Big Caslon" w:cs="Big Caslon"/>
-          <w:sz w:val="12"/>
-          <w:szCs w:val="12"/>
-        </w:rPr>
-      </w:pPr>
-      <w:r>
-        <w:rPr>
-          <w:rFonts w:ascii="Big Caslon" w:hAnsi="Big Caslon" w:eastAsia="Big Caslon" w:cs="Big Caslon"/>
+          <w:rFonts w:ascii="Big Caslon Medium" w:hAnsi="Big Caslon Medium" w:eastAsia="Big Caslon Medium" w:cs="Big Caslon Medium"/>
+          <w:sz w:val="12"/>
+          <w:szCs w:val="12"/>
+        </w:rPr>
+      </w:pPr>
+      <w:r>
+        <w:rPr>
+          <w:rFonts w:ascii="Big Caslon Medium" w:hAnsi="Big Caslon Medium" w:eastAsia="Big Caslon Medium" w:cs="Big Caslon Medium"/>
           <w:sz w:val="12"/>
           <w:szCs w:val="12"/>
         </w:rPr>
@@ -4090,14 +4090,14 @@
         <w:jc w:val="left"/>
         <w:widowControl w:val="0"/>
         <w:rPr>
-          <w:rFonts w:ascii="Big Caslon" w:hAnsi="Big Caslon" w:eastAsia="Big Caslon" w:cs="Big Caslon"/>
-          <w:sz w:val="12"/>
-          <w:szCs w:val="12"/>
-        </w:rPr>
-      </w:pPr>
-      <w:r>
-        <w:rPr>
-          <w:rFonts w:ascii="Big Caslon" w:hAnsi="Big Caslon" w:eastAsia="Big Caslon" w:cs="Big Caslon"/>
+          <w:rFonts w:ascii="Big Caslon Medium" w:hAnsi="Big Caslon Medium" w:eastAsia="Big Caslon Medium" w:cs="Big Caslon Medium"/>
+          <w:sz w:val="12"/>
+          <w:szCs w:val="12"/>
+        </w:rPr>
+      </w:pPr>
+      <w:r>
+        <w:rPr>
+          <w:rFonts w:ascii="Big Caslon Medium" w:hAnsi="Big Caslon Medium" w:eastAsia="Big Caslon Medium" w:cs="Big Caslon Medium"/>
           <w:sz w:val="12"/>
           <w:szCs w:val="12"/>
         </w:rPr>
@@ -4110,14 +4110,14 @@
         <w:jc w:val="left"/>
         <w:widowControl w:val="0"/>
         <w:rPr>
-          <w:rFonts w:ascii="Big Caslon" w:hAnsi="Big Caslon" w:eastAsia="Big Caslon" w:cs="Big Caslon"/>
-          <w:sz w:val="12"/>
-          <w:szCs w:val="12"/>
-        </w:rPr>
-      </w:pPr>
-      <w:r>
-        <w:rPr>
-          <w:rFonts w:ascii="Big Caslon" w:hAnsi="Big Caslon" w:eastAsia="Big Caslon" w:cs="Big Caslon"/>
+          <w:rFonts w:ascii="Big Caslon Medium" w:hAnsi="Big Caslon Medium" w:eastAsia="Big Caslon Medium" w:cs="Big Caslon Medium"/>
+          <w:sz w:val="12"/>
+          <w:szCs w:val="12"/>
+        </w:rPr>
+      </w:pPr>
+      <w:r>
+        <w:rPr>
+          <w:rFonts w:ascii="Big Caslon Medium" w:hAnsi="Big Caslon Medium" w:eastAsia="Big Caslon Medium" w:cs="Big Caslon Medium"/>
           <w:sz w:val="12"/>
           <w:szCs w:val="12"/>
         </w:rPr>
@@ -4130,14 +4130,14 @@
         <w:jc w:val="left"/>
         <w:widowControl w:val="0"/>
         <w:rPr>
-          <w:rFonts w:ascii="Big Caslon" w:hAnsi="Big Caslon" w:eastAsia="Big Caslon" w:cs="Big Caslon"/>
-          <w:sz w:val="12"/>
-          <w:szCs w:val="12"/>
-        </w:rPr>
-      </w:pPr>
-      <w:r>
-        <w:rPr>
-          <w:rFonts w:ascii="Big Caslon" w:hAnsi="Big Caslon" w:eastAsia="Big Caslon" w:cs="Big Caslon"/>
+          <w:rFonts w:ascii="Big Caslon Medium" w:hAnsi="Big Caslon Medium" w:eastAsia="Big Caslon Medium" w:cs="Big Caslon Medium"/>
+          <w:sz w:val="12"/>
+          <w:szCs w:val="12"/>
+        </w:rPr>
+      </w:pPr>
+      <w:r>
+        <w:rPr>
+          <w:rFonts w:ascii="Big Caslon Medium" w:hAnsi="Big Caslon Medium" w:eastAsia="Big Caslon Medium" w:cs="Big Caslon Medium"/>
           <w:sz w:val="12"/>
           <w:szCs w:val="12"/>
         </w:rPr>
@@ -4150,14 +4150,14 @@
         <w:jc w:val="left"/>
         <w:widowControl w:val="0"/>
         <w:rPr>
-          <w:rFonts w:ascii="Big Caslon" w:hAnsi="Big Caslon" w:eastAsia="Big Caslon" w:cs="Big Caslon"/>
-          <w:sz w:val="12"/>
-          <w:szCs w:val="12"/>
-        </w:rPr>
-      </w:pPr>
-      <w:r>
-        <w:rPr>
-          <w:rFonts w:ascii="Big Caslon" w:hAnsi="Big Caslon" w:eastAsia="Big Caslon" w:cs="Big Caslon"/>
+          <w:rFonts w:ascii="Big Caslon Medium" w:hAnsi="Big Caslon Medium" w:eastAsia="Big Caslon Medium" w:cs="Big Caslon Medium"/>
+          <w:sz w:val="12"/>
+          <w:szCs w:val="12"/>
+        </w:rPr>
+      </w:pPr>
+      <w:r>
+        <w:rPr>
+          <w:rFonts w:ascii="Big Caslon Medium" w:hAnsi="Big Caslon Medium" w:eastAsia="Big Caslon Medium" w:cs="Big Caslon Medium"/>
           <w:sz w:val="12"/>
           <w:szCs w:val="12"/>
         </w:rPr>
@@ -4170,14 +4170,14 @@
         <w:jc w:val="left"/>
         <w:widowControl w:val="0"/>
         <w:rPr>
-          <w:rFonts w:ascii="Big Caslon" w:hAnsi="Big Caslon" w:eastAsia="Big Caslon" w:cs="Big Caslon"/>
-          <w:sz w:val="12"/>
-          <w:szCs w:val="12"/>
-        </w:rPr>
-      </w:pPr>
-      <w:r>
-        <w:rPr>
-          <w:rFonts w:ascii="Big Caslon" w:hAnsi="Big Caslon" w:eastAsia="Big Caslon" w:cs="Big Caslon"/>
+          <w:rFonts w:ascii="Big Caslon Medium" w:hAnsi="Big Caslon Medium" w:eastAsia="Big Caslon Medium" w:cs="Big Caslon Medium"/>
+          <w:sz w:val="12"/>
+          <w:szCs w:val="12"/>
+        </w:rPr>
+      </w:pPr>
+      <w:r>
+        <w:rPr>
+          <w:rFonts w:ascii="Big Caslon Medium" w:hAnsi="Big Caslon Medium" w:eastAsia="Big Caslon Medium" w:cs="Big Caslon Medium"/>
           <w:sz w:val="12"/>
           <w:szCs w:val="12"/>
         </w:rPr>
@@ -4190,14 +4190,14 @@
         <w:jc w:val="left"/>
         <w:widowControl w:val="0"/>
         <w:rPr>
-          <w:rFonts w:ascii="Big Caslon" w:hAnsi="Big Caslon" w:eastAsia="Big Caslon" w:cs="Big Caslon"/>
-          <w:sz w:val="12"/>
-          <w:szCs w:val="12"/>
-        </w:rPr>
-      </w:pPr>
-      <w:r>
-        <w:rPr>
-          <w:rFonts w:ascii="Big Caslon" w:hAnsi="Big Caslon" w:eastAsia="Big Caslon" w:cs="Big Caslon"/>
+          <w:rFonts w:ascii="Big Caslon Medium" w:hAnsi="Big Caslon Medium" w:eastAsia="Big Caslon Medium" w:cs="Big Caslon Medium"/>
+          <w:sz w:val="12"/>
+          <w:szCs w:val="12"/>
+        </w:rPr>
+      </w:pPr>
+      <w:r>
+        <w:rPr>
+          <w:rFonts w:ascii="Big Caslon Medium" w:hAnsi="Big Caslon Medium" w:eastAsia="Big Caslon Medium" w:cs="Big Caslon Medium"/>
           <w:sz w:val="12"/>
           <w:szCs w:val="12"/>
         </w:rPr>
@@ -4210,14 +4210,14 @@
         <w:jc w:val="left"/>
         <w:widowControl w:val="0"/>
         <w:rPr>
-          <w:rFonts w:ascii="Big Caslon" w:hAnsi="Big Caslon" w:eastAsia="Big Caslon" w:cs="Big Caslon"/>
-          <w:sz w:val="12"/>
-          <w:szCs w:val="12"/>
-        </w:rPr>
-      </w:pPr>
-      <w:r>
-        <w:rPr>
-          <w:rFonts w:ascii="Big Caslon" w:hAnsi="Big Caslon" w:eastAsia="Big Caslon" w:cs="Big Caslon"/>
+          <w:rFonts w:ascii="Big Caslon Medium" w:hAnsi="Big Caslon Medium" w:eastAsia="Big Caslon Medium" w:cs="Big Caslon Medium"/>
+          <w:sz w:val="12"/>
+          <w:szCs w:val="12"/>
+        </w:rPr>
+      </w:pPr>
+      <w:r>
+        <w:rPr>
+          <w:rFonts w:ascii="Big Caslon Medium" w:hAnsi="Big Caslon Medium" w:eastAsia="Big Caslon Medium" w:cs="Big Caslon Medium"/>
           <w:sz w:val="12"/>
           <w:szCs w:val="12"/>
         </w:rPr>
@@ -4230,14 +4230,14 @@
         <w:jc w:val="left"/>
         <w:widowControl w:val="0"/>
         <w:rPr>
-          <w:rFonts w:ascii="Big Caslon" w:hAnsi="Big Caslon" w:eastAsia="Big Caslon" w:cs="Big Caslon"/>
-          <w:sz w:val="12"/>
-          <w:szCs w:val="12"/>
-        </w:rPr>
-      </w:pPr>
-      <w:r>
-        <w:rPr>
-          <w:rFonts w:ascii="Big Caslon" w:hAnsi="Big Caslon" w:eastAsia="Big Caslon" w:cs="Big Caslon"/>
+          <w:rFonts w:ascii="Big Caslon Medium" w:hAnsi="Big Caslon Medium" w:eastAsia="Big Caslon Medium" w:cs="Big Caslon Medium"/>
+          <w:sz w:val="12"/>
+          <w:szCs w:val="12"/>
+        </w:rPr>
+      </w:pPr>
+      <w:r>
+        <w:rPr>
+          <w:rFonts w:ascii="Big Caslon Medium" w:hAnsi="Big Caslon Medium" w:eastAsia="Big Caslon Medium" w:cs="Big Caslon Medium"/>
           <w:sz w:val="12"/>
           <w:szCs w:val="12"/>
         </w:rPr>
@@ -4250,14 +4250,14 @@
         <w:jc w:val="left"/>
         <w:widowControl w:val="0"/>
         <w:rPr>
-          <w:rFonts w:ascii="Big Caslon" w:hAnsi="Big Caslon" w:eastAsia="Big Caslon" w:cs="Big Caslon"/>
-          <w:sz w:val="12"/>
-          <w:szCs w:val="12"/>
-        </w:rPr>
-      </w:pPr>
-      <w:r>
-        <w:rPr>
-          <w:rFonts w:ascii="Big Caslon" w:hAnsi="Big Caslon" w:eastAsia="Big Caslon" w:cs="Big Caslon"/>
+          <w:rFonts w:ascii="Big Caslon Medium" w:hAnsi="Big Caslon Medium" w:eastAsia="Big Caslon Medium" w:cs="Big Caslon Medium"/>
+          <w:sz w:val="12"/>
+          <w:szCs w:val="12"/>
+        </w:rPr>
+      </w:pPr>
+      <w:r>
+        <w:rPr>
+          <w:rFonts w:ascii="Big Caslon Medium" w:hAnsi="Big Caslon Medium" w:eastAsia="Big Caslon Medium" w:cs="Big Caslon Medium"/>
           <w:sz w:val="12"/>
           <w:szCs w:val="12"/>
         </w:rPr>
@@ -4270,14 +4270,14 @@
         <w:jc w:val="left"/>
         <w:widowControl w:val="0"/>
         <w:rPr>
-          <w:rFonts w:ascii="Big Caslon" w:hAnsi="Big Caslon" w:eastAsia="Big Caslon" w:cs="Big Caslon"/>
-          <w:sz w:val="12"/>
-          <w:szCs w:val="12"/>
-        </w:rPr>
-      </w:pPr>
-      <w:r>
-        <w:rPr>
-          <w:rFonts w:ascii="Big Caslon" w:hAnsi="Big Caslon" w:eastAsia="Big Caslon" w:cs="Big Caslon"/>
+          <w:rFonts w:ascii="Big Caslon Medium" w:hAnsi="Big Caslon Medium" w:eastAsia="Big Caslon Medium" w:cs="Big Caslon Medium"/>
+          <w:sz w:val="12"/>
+          <w:szCs w:val="12"/>
+        </w:rPr>
+      </w:pPr>
+      <w:r>
+        <w:rPr>
+          <w:rFonts w:ascii="Big Caslon Medium" w:hAnsi="Big Caslon Medium" w:eastAsia="Big Caslon Medium" w:cs="Big Caslon Medium"/>
           <w:sz w:val="12"/>
           <w:szCs w:val="12"/>
         </w:rPr>
@@ -4290,14 +4290,14 @@
         <w:jc w:val="left"/>
         <w:widowControl w:val="0"/>
         <w:rPr>
-          <w:rFonts w:ascii="Big Caslon" w:hAnsi="Big Caslon" w:eastAsia="Big Caslon" w:cs="Big Caslon"/>
-          <w:sz w:val="12"/>
-          <w:szCs w:val="12"/>
-        </w:rPr>
-      </w:pPr>
-      <w:r>
-        <w:rPr>
-          <w:rFonts w:ascii="Big Caslon" w:hAnsi="Big Caslon" w:eastAsia="Big Caslon" w:cs="Big Caslon"/>
+          <w:rFonts w:ascii="Big Caslon Medium" w:hAnsi="Big Caslon Medium" w:eastAsia="Big Caslon Medium" w:cs="Big Caslon Medium"/>
+          <w:sz w:val="12"/>
+          <w:szCs w:val="12"/>
+        </w:rPr>
+      </w:pPr>
+      <w:r>
+        <w:rPr>
+          <w:rFonts w:ascii="Big Caslon Medium" w:hAnsi="Big Caslon Medium" w:eastAsia="Big Caslon Medium" w:cs="Big Caslon Medium"/>
           <w:sz w:val="12"/>
           <w:szCs w:val="12"/>
         </w:rPr>
@@ -4310,14 +4310,14 @@
         <w:jc w:val="left"/>
         <w:widowControl w:val="0"/>
         <w:rPr>
-          <w:rFonts w:ascii="Big Caslon" w:hAnsi="Big Caslon" w:eastAsia="Big Caslon" w:cs="Big Caslon"/>
-          <w:sz w:val="12"/>
-          <w:szCs w:val="12"/>
-        </w:rPr>
-      </w:pPr>
-      <w:r>
-        <w:rPr>
-          <w:rFonts w:ascii="Big Caslon" w:hAnsi="Big Caslon" w:eastAsia="Big Caslon" w:cs="Big Caslon"/>
+          <w:rFonts w:ascii="Big Caslon Medium" w:hAnsi="Big Caslon Medium" w:eastAsia="Big Caslon Medium" w:cs="Big Caslon Medium"/>
+          <w:sz w:val="12"/>
+          <w:szCs w:val="12"/>
+        </w:rPr>
+      </w:pPr>
+      <w:r>
+        <w:rPr>
+          <w:rFonts w:ascii="Big Caslon Medium" w:hAnsi="Big Caslon Medium" w:eastAsia="Big Caslon Medium" w:cs="Big Caslon Medium"/>
           <w:sz w:val="12"/>
           <w:szCs w:val="12"/>
         </w:rPr>
@@ -4330,14 +4330,14 @@
         <w:jc w:val="left"/>
         <w:widowControl w:val="0"/>
         <w:rPr>
-          <w:rFonts w:ascii="Big Caslon" w:hAnsi="Big Caslon" w:eastAsia="Big Caslon" w:cs="Big Caslon"/>
-          <w:sz w:val="12"/>
-          <w:szCs w:val="12"/>
-        </w:rPr>
-      </w:pPr>
-      <w:r>
-        <w:rPr>
-          <w:rFonts w:ascii="Big Caslon" w:hAnsi="Big Caslon" w:eastAsia="Big Caslon" w:cs="Big Caslon"/>
+          <w:rFonts w:ascii="Big Caslon Medium" w:hAnsi="Big Caslon Medium" w:eastAsia="Big Caslon Medium" w:cs="Big Caslon Medium"/>
+          <w:sz w:val="12"/>
+          <w:szCs w:val="12"/>
+        </w:rPr>
+      </w:pPr>
+      <w:r>
+        <w:rPr>
+          <w:rFonts w:ascii="Big Caslon Medium" w:hAnsi="Big Caslon Medium" w:eastAsia="Big Caslon Medium" w:cs="Big Caslon Medium"/>
           <w:sz w:val="12"/>
           <w:szCs w:val="12"/>
         </w:rPr>
@@ -4350,14 +4350,14 @@
         <w:jc w:val="left"/>
         <w:widowControl w:val="0"/>
         <w:rPr>
-          <w:rFonts w:ascii="Big Caslon" w:hAnsi="Big Caslon" w:eastAsia="Big Caslon" w:cs="Big Caslon"/>
-          <w:sz w:val="12"/>
-          <w:szCs w:val="12"/>
-        </w:rPr>
-      </w:pPr>
-      <w:r>
-        <w:rPr>
-          <w:rFonts w:ascii="Big Caslon" w:hAnsi="Big Caslon" w:eastAsia="Big Caslon" w:cs="Big Caslon"/>
+          <w:rFonts w:ascii="Big Caslon Medium" w:hAnsi="Big Caslon Medium" w:eastAsia="Big Caslon Medium" w:cs="Big Caslon Medium"/>
+          <w:sz w:val="12"/>
+          <w:szCs w:val="12"/>
+        </w:rPr>
+      </w:pPr>
+      <w:r>
+        <w:rPr>
+          <w:rFonts w:ascii="Big Caslon Medium" w:hAnsi="Big Caslon Medium" w:eastAsia="Big Caslon Medium" w:cs="Big Caslon Medium"/>
           <w:sz w:val="12"/>
           <w:szCs w:val="12"/>
         </w:rPr>
@@ -4370,14 +4370,14 @@
         <w:jc w:val="left"/>
         <w:widowControl w:val="0"/>
         <w:rPr>
-          <w:rFonts w:ascii="Big Caslon" w:hAnsi="Big Caslon" w:eastAsia="Big Caslon" w:cs="Big Caslon"/>
-          <w:sz w:val="12"/>
-          <w:szCs w:val="12"/>
-        </w:rPr>
-      </w:pPr>
-      <w:r>
-        <w:rPr>
-          <w:rFonts w:ascii="Big Caslon" w:hAnsi="Big Caslon" w:eastAsia="Big Caslon" w:cs="Big Caslon"/>
+          <w:rFonts w:ascii="Big Caslon Medium" w:hAnsi="Big Caslon Medium" w:eastAsia="Big Caslon Medium" w:cs="Big Caslon Medium"/>
+          <w:sz w:val="12"/>
+          <w:szCs w:val="12"/>
+        </w:rPr>
+      </w:pPr>
+      <w:r>
+        <w:rPr>
+          <w:rFonts w:ascii="Big Caslon Medium" w:hAnsi="Big Caslon Medium" w:eastAsia="Big Caslon Medium" w:cs="Big Caslon Medium"/>
           <w:sz w:val="12"/>
           <w:szCs w:val="12"/>
         </w:rPr>
@@ -4390,14 +4390,14 @@
         <w:jc w:val="left"/>
         <w:widowControl w:val="0"/>
         <w:rPr>
-          <w:rFonts w:ascii="Big Caslon" w:hAnsi="Big Caslon" w:eastAsia="Big Caslon" w:cs="Big Caslon"/>
-          <w:sz w:val="12"/>
-          <w:szCs w:val="12"/>
-        </w:rPr>
-      </w:pPr>
-      <w:r>
-        <w:rPr>
-          <w:rFonts w:ascii="Big Caslon" w:hAnsi="Big Caslon" w:eastAsia="Big Caslon" w:cs="Big Caslon"/>
+          <w:rFonts w:ascii="Big Caslon Medium" w:hAnsi="Big Caslon Medium" w:eastAsia="Big Caslon Medium" w:cs="Big Caslon Medium"/>
+          <w:sz w:val="12"/>
+          <w:szCs w:val="12"/>
+        </w:rPr>
+      </w:pPr>
+      <w:r>
+        <w:rPr>
+          <w:rFonts w:ascii="Big Caslon Medium" w:hAnsi="Big Caslon Medium" w:eastAsia="Big Caslon Medium" w:cs="Big Caslon Medium"/>
           <w:sz w:val="12"/>
           <w:szCs w:val="12"/>
         </w:rPr>
@@ -4410,14 +4410,14 @@
         <w:jc w:val="left"/>
         <w:widowControl w:val="0"/>
         <w:rPr>
-          <w:rFonts w:ascii="Big Caslon" w:hAnsi="Big Caslon" w:eastAsia="Big Caslon" w:cs="Big Caslon"/>
-          <w:sz w:val="12"/>
-          <w:szCs w:val="12"/>
-        </w:rPr>
-      </w:pPr>
-      <w:r>
-        <w:rPr>
-          <w:rFonts w:ascii="Big Caslon" w:hAnsi="Big Caslon" w:eastAsia="Big Caslon" w:cs="Big Caslon"/>
+          <w:rFonts w:ascii="Big Caslon Medium" w:hAnsi="Big Caslon Medium" w:eastAsia="Big Caslon Medium" w:cs="Big Caslon Medium"/>
+          <w:sz w:val="12"/>
+          <w:szCs w:val="12"/>
+        </w:rPr>
+      </w:pPr>
+      <w:r>
+        <w:rPr>
+          <w:rFonts w:ascii="Big Caslon Medium" w:hAnsi="Big Caslon Medium" w:eastAsia="Big Caslon Medium" w:cs="Big Caslon Medium"/>
           <w:sz w:val="12"/>
           <w:szCs w:val="12"/>
         </w:rPr>
@@ -4430,14 +4430,14 @@
         <w:jc w:val="left"/>
         <w:widowControl w:val="0"/>
         <w:rPr>
-          <w:rFonts w:ascii="Big Caslon" w:hAnsi="Big Caslon" w:eastAsia="Big Caslon" w:cs="Big Caslon"/>
-          <w:sz w:val="12"/>
-          <w:szCs w:val="12"/>
-        </w:rPr>
-      </w:pPr>
-      <w:r>
-        <w:rPr>
-          <w:rFonts w:ascii="Big Caslon" w:hAnsi="Big Caslon" w:eastAsia="Big Caslon" w:cs="Big Caslon"/>
+          <w:rFonts w:ascii="Big Caslon Medium" w:hAnsi="Big Caslon Medium" w:eastAsia="Big Caslon Medium" w:cs="Big Caslon Medium"/>
+          <w:sz w:val="12"/>
+          <w:szCs w:val="12"/>
+        </w:rPr>
+      </w:pPr>
+      <w:r>
+        <w:rPr>
+          <w:rFonts w:ascii="Big Caslon Medium" w:hAnsi="Big Caslon Medium" w:eastAsia="Big Caslon Medium" w:cs="Big Caslon Medium"/>
           <w:sz w:val="12"/>
           <w:szCs w:val="12"/>
         </w:rPr>
@@ -4450,14 +4450,14 @@
         <w:jc w:val="left"/>
         <w:widowControl w:val="0"/>
         <w:rPr>
-          <w:rFonts w:ascii="Big Caslon" w:hAnsi="Big Caslon" w:eastAsia="Big Caslon" w:cs="Big Caslon"/>
-          <w:sz w:val="12"/>
-          <w:szCs w:val="12"/>
-        </w:rPr>
-      </w:pPr>
-      <w:r>
-        <w:rPr>
-          <w:rFonts w:ascii="Big Caslon" w:hAnsi="Big Caslon" w:eastAsia="Big Caslon" w:cs="Big Caslon"/>
+          <w:rFonts w:ascii="Big Caslon Medium" w:hAnsi="Big Caslon Medium" w:eastAsia="Big Caslon Medium" w:cs="Big Caslon Medium"/>
+          <w:sz w:val="12"/>
+          <w:szCs w:val="12"/>
+        </w:rPr>
+      </w:pPr>
+      <w:r>
+        <w:rPr>
+          <w:rFonts w:ascii="Big Caslon Medium" w:hAnsi="Big Caslon Medium" w:eastAsia="Big Caslon Medium" w:cs="Big Caslon Medium"/>
           <w:sz w:val="12"/>
           <w:szCs w:val="12"/>
         </w:rPr>
@@ -4470,14 +4470,14 @@
         <w:jc w:val="left"/>
         <w:widowControl w:val="0"/>
         <w:rPr>
-          <w:rFonts w:ascii="Big Caslon" w:hAnsi="Big Caslon" w:eastAsia="Big Caslon" w:cs="Big Caslon"/>
-          <w:sz w:val="12"/>
-          <w:szCs w:val="12"/>
-        </w:rPr>
-      </w:pPr>
-      <w:r>
-        <w:rPr>
-          <w:rFonts w:ascii="Big Caslon" w:hAnsi="Big Caslon" w:eastAsia="Big Caslon" w:cs="Big Caslon"/>
+          <w:rFonts w:ascii="Big Caslon Medium" w:hAnsi="Big Caslon Medium" w:eastAsia="Big Caslon Medium" w:cs="Big Caslon Medium"/>
+          <w:sz w:val="12"/>
+          <w:szCs w:val="12"/>
+        </w:rPr>
+      </w:pPr>
+      <w:r>
+        <w:rPr>
+          <w:rFonts w:ascii="Big Caslon Medium" w:hAnsi="Big Caslon Medium" w:eastAsia="Big Caslon Medium" w:cs="Big Caslon Medium"/>
           <w:sz w:val="12"/>
           <w:szCs w:val="12"/>
         </w:rPr>
@@ -4490,14 +4490,14 @@
         <w:jc w:val="left"/>
         <w:widowControl w:val="0"/>
         <w:rPr>
-          <w:rFonts w:ascii="Big Caslon" w:hAnsi="Big Caslon" w:eastAsia="Big Caslon" w:cs="Big Caslon"/>
-          <w:sz w:val="12"/>
-          <w:szCs w:val="12"/>
-        </w:rPr>
-      </w:pPr>
-      <w:r>
-        <w:rPr>
-          <w:rFonts w:ascii="Big Caslon" w:hAnsi="Big Caslon" w:eastAsia="Big Caslon" w:cs="Big Caslon"/>
+          <w:rFonts w:ascii="Big Caslon Medium" w:hAnsi="Big Caslon Medium" w:eastAsia="Big Caslon Medium" w:cs="Big Caslon Medium"/>
+          <w:sz w:val="12"/>
+          <w:szCs w:val="12"/>
+        </w:rPr>
+      </w:pPr>
+      <w:r>
+        <w:rPr>
+          <w:rFonts w:ascii="Big Caslon Medium" w:hAnsi="Big Caslon Medium" w:eastAsia="Big Caslon Medium" w:cs="Big Caslon Medium"/>
           <w:sz w:val="12"/>
           <w:szCs w:val="12"/>
         </w:rPr>
@@ -4510,14 +4510,14 @@
         <w:jc w:val="left"/>
         <w:widowControl w:val="0"/>
         <w:rPr>
-          <w:rFonts w:ascii="Big Caslon" w:hAnsi="Big Caslon" w:eastAsia="Big Caslon" w:cs="Big Caslon"/>
-          <w:sz w:val="12"/>
-          <w:szCs w:val="12"/>
-        </w:rPr>
-      </w:pPr>
-      <w:r>
-        <w:rPr>
-          <w:rFonts w:ascii="Big Caslon" w:hAnsi="Big Caslon" w:eastAsia="Big Caslon" w:cs="Big Caslon"/>
+          <w:rFonts w:ascii="Big Caslon Medium" w:hAnsi="Big Caslon Medium" w:eastAsia="Big Caslon Medium" w:cs="Big Caslon Medium"/>
+          <w:sz w:val="12"/>
+          <w:szCs w:val="12"/>
+        </w:rPr>
+      </w:pPr>
+      <w:r>
+        <w:rPr>
+          <w:rFonts w:ascii="Big Caslon Medium" w:hAnsi="Big Caslon Medium" w:eastAsia="Big Caslon Medium" w:cs="Big Caslon Medium"/>
           <w:sz w:val="12"/>
           <w:szCs w:val="12"/>
         </w:rPr>
@@ -4530,14 +4530,14 @@
         <w:jc w:val="left"/>
         <w:widowControl w:val="0"/>
         <w:rPr>
-          <w:rFonts w:ascii="Big Caslon" w:hAnsi="Big Caslon" w:eastAsia="Big Caslon" w:cs="Big Caslon"/>
-          <w:sz w:val="12"/>
-          <w:szCs w:val="12"/>
-        </w:rPr>
-      </w:pPr>
-      <w:r>
-        <w:rPr>
-          <w:rFonts w:ascii="Big Caslon" w:hAnsi="Big Caslon" w:eastAsia="Big Caslon" w:cs="Big Caslon"/>
+          <w:rFonts w:ascii="Big Caslon Medium" w:hAnsi="Big Caslon Medium" w:eastAsia="Big Caslon Medium" w:cs="Big Caslon Medium"/>
+          <w:sz w:val="12"/>
+          <w:szCs w:val="12"/>
+        </w:rPr>
+      </w:pPr>
+      <w:r>
+        <w:rPr>
+          <w:rFonts w:ascii="Big Caslon Medium" w:hAnsi="Big Caslon Medium" w:eastAsia="Big Caslon Medium" w:cs="Big Caslon Medium"/>
           <w:sz w:val="12"/>
           <w:szCs w:val="12"/>
         </w:rPr>
@@ -4550,14 +4550,14 @@
         <w:jc w:val="left"/>
         <w:widowControl w:val="0"/>
         <w:rPr>
-          <w:rFonts w:ascii="Big Caslon" w:hAnsi="Big Caslon" w:eastAsia="Big Caslon" w:cs="Big Caslon"/>
-          <w:sz w:val="12"/>
-          <w:szCs w:val="12"/>
-        </w:rPr>
-      </w:pPr>
-      <w:r>
-        <w:rPr>
-          <w:rFonts w:ascii="Big Caslon" w:hAnsi="Big Caslon" w:eastAsia="Big Caslon" w:cs="Big Caslon"/>
+          <w:rFonts w:ascii="Big Caslon Medium" w:hAnsi="Big Caslon Medium" w:eastAsia="Big Caslon Medium" w:cs="Big Caslon Medium"/>
+          <w:sz w:val="12"/>
+          <w:szCs w:val="12"/>
+        </w:rPr>
+      </w:pPr>
+      <w:r>
+        <w:rPr>
+          <w:rFonts w:ascii="Big Caslon Medium" w:hAnsi="Big Caslon Medium" w:eastAsia="Big Caslon Medium" w:cs="Big Caslon Medium"/>
           <w:sz w:val="12"/>
           <w:szCs w:val="12"/>
         </w:rPr>
@@ -4570,14 +4570,14 @@
         <w:jc w:val="left"/>
         <w:widowControl w:val="0"/>
         <w:rPr>
-          <w:rFonts w:ascii="Big Caslon" w:hAnsi="Big Caslon" w:eastAsia="Big Caslon" w:cs="Big Caslon"/>
-          <w:sz w:val="12"/>
-          <w:szCs w:val="12"/>
-        </w:rPr>
-      </w:pPr>
-      <w:r>
-        <w:rPr>
-          <w:rFonts w:ascii="Big Caslon" w:hAnsi="Big Caslon" w:eastAsia="Big Caslon" w:cs="Big Caslon"/>
+          <w:rFonts w:ascii="Big Caslon Medium" w:hAnsi="Big Caslon Medium" w:eastAsia="Big Caslon Medium" w:cs="Big Caslon Medium"/>
+          <w:sz w:val="12"/>
+          <w:szCs w:val="12"/>
+        </w:rPr>
+      </w:pPr>
+      <w:r>
+        <w:rPr>
+          <w:rFonts w:ascii="Big Caslon Medium" w:hAnsi="Big Caslon Medium" w:eastAsia="Big Caslon Medium" w:cs="Big Caslon Medium"/>
           <w:sz w:val="12"/>
           <w:szCs w:val="12"/>
         </w:rPr>
@@ -4590,14 +4590,14 @@
         <w:jc w:val="left"/>
         <w:widowControl w:val="0"/>
         <w:rPr>
-          <w:rFonts w:ascii="Big Caslon" w:hAnsi="Big Caslon" w:eastAsia="Big Caslon" w:cs="Big Caslon"/>
-          <w:sz w:val="12"/>
-          <w:szCs w:val="12"/>
-        </w:rPr>
-      </w:pPr>
-      <w:r>
-        <w:rPr>
-          <w:rFonts w:ascii="Big Caslon" w:hAnsi="Big Caslon" w:eastAsia="Big Caslon" w:cs="Big Caslon"/>
+          <w:rFonts w:ascii="Big Caslon Medium" w:hAnsi="Big Caslon Medium" w:eastAsia="Big Caslon Medium" w:cs="Big Caslon Medium"/>
+          <w:sz w:val="12"/>
+          <w:szCs w:val="12"/>
+        </w:rPr>
+      </w:pPr>
+      <w:r>
+        <w:rPr>
+          <w:rFonts w:ascii="Big Caslon Medium" w:hAnsi="Big Caslon Medium" w:eastAsia="Big Caslon Medium" w:cs="Big Caslon Medium"/>
           <w:sz w:val="12"/>
           <w:szCs w:val="12"/>
         </w:rPr>
@@ -4610,14 +4610,14 @@
         <w:jc w:val="left"/>
         <w:widowControl w:val="0"/>
         <w:rPr>
-          <w:rFonts w:ascii="Big Caslon" w:hAnsi="Big Caslon" w:eastAsia="Big Caslon" w:cs="Big Caslon"/>
-          <w:sz w:val="12"/>
-          <w:szCs w:val="12"/>
-        </w:rPr>
-      </w:pPr>
-      <w:r>
-        <w:rPr>
-          <w:rFonts w:ascii="Big Caslon" w:hAnsi="Big Caslon" w:eastAsia="Big Caslon" w:cs="Big Caslon"/>
+          <w:rFonts w:ascii="Big Caslon Medium" w:hAnsi="Big Caslon Medium" w:eastAsia="Big Caslon Medium" w:cs="Big Caslon Medium"/>
+          <w:sz w:val="12"/>
+          <w:szCs w:val="12"/>
+        </w:rPr>
+      </w:pPr>
+      <w:r>
+        <w:rPr>
+          <w:rFonts w:ascii="Big Caslon Medium" w:hAnsi="Big Caslon Medium" w:eastAsia="Big Caslon Medium" w:cs="Big Caslon Medium"/>
           <w:sz w:val="12"/>
           <w:szCs w:val="12"/>
         </w:rPr>
@@ -4631,14 +4631,14 @@
         <w:jc w:val="left"/>
         <w:widowControl w:val="0"/>
         <w:rPr>
-          <w:rFonts w:ascii="Big Caslon" w:hAnsi="Big Caslon" w:eastAsia="Big Caslon" w:cs="Big Caslon"/>
-          <w:sz w:val="15"/>
-          <w:szCs w:val="15"/>
-        </w:rPr>
-      </w:pPr>
-      <w:r>
-        <w:rPr>
-          <w:rFonts w:ascii="Big Caslon" w:hAnsi="Big Caslon" w:eastAsia="Big Caslon" w:cs="Big Caslon"/>
+          <w:rFonts w:ascii="Big Caslon Medium" w:hAnsi="Big Caslon Medium" w:eastAsia="Big Caslon Medium" w:cs="Big Caslon Medium"/>
+          <w:sz w:val="15"/>
+          <w:szCs w:val="15"/>
+        </w:rPr>
+      </w:pPr>
+      <w:r>
+        <w:rPr>
+          <w:rFonts w:ascii="Big Caslon Medium" w:hAnsi="Big Caslon Medium" w:eastAsia="Big Caslon Medium" w:cs="Big Caslon Medium"/>
           <w:sz w:val="15"/>
           <w:szCs w:val="15"/>
         </w:rPr>
@@ -4651,14 +4651,14 @@
         <w:jc w:val="left"/>
         <w:widowControl w:val="0"/>
         <w:rPr>
-          <w:rFonts w:ascii="Big Caslon" w:hAnsi="Big Caslon" w:eastAsia="Big Caslon" w:cs="Big Caslon"/>
-          <w:sz w:val="15"/>
-          <w:szCs w:val="15"/>
-        </w:rPr>
-      </w:pPr>
-      <w:r>
-        <w:rPr>
-          <w:rFonts w:ascii="Big Caslon" w:hAnsi="Big Caslon" w:eastAsia="Big Caslon" w:cs="Big Caslon"/>
+          <w:rFonts w:ascii="Big Caslon Medium" w:hAnsi="Big Caslon Medium" w:eastAsia="Big Caslon Medium" w:cs="Big Caslon Medium"/>
+          <w:sz w:val="15"/>
+          <w:szCs w:val="15"/>
+        </w:rPr>
+      </w:pPr>
+      <w:r>
+        <w:rPr>
+          <w:rFonts w:ascii="Big Caslon Medium" w:hAnsi="Big Caslon Medium" w:eastAsia="Big Caslon Medium" w:cs="Big Caslon Medium"/>
           <w:sz w:val="15"/>
           <w:szCs w:val="15"/>
         </w:rPr>
@@ -4671,14 +4671,14 @@
         <w:jc w:val="left"/>
         <w:widowControl w:val="0"/>
         <w:rPr>
-          <w:rFonts w:ascii="Big Caslon" w:hAnsi="Big Caslon" w:eastAsia="Big Caslon" w:cs="Big Caslon"/>
-          <w:sz w:val="15"/>
-          <w:szCs w:val="15"/>
-        </w:rPr>
-      </w:pPr>
-      <w:r>
-        <w:rPr>
-          <w:rFonts w:ascii="Big Caslon" w:hAnsi="Big Caslon" w:eastAsia="Big Caslon" w:cs="Big Caslon"/>
+          <w:rFonts w:ascii="Big Caslon Medium" w:hAnsi="Big Caslon Medium" w:eastAsia="Big Caslon Medium" w:cs="Big Caslon Medium"/>
+          <w:sz w:val="15"/>
+          <w:szCs w:val="15"/>
+        </w:rPr>
+      </w:pPr>
+      <w:r>
+        <w:rPr>
+          <w:rFonts w:ascii="Big Caslon Medium" w:hAnsi="Big Caslon Medium" w:eastAsia="Big Caslon Medium" w:cs="Big Caslon Medium"/>
           <w:sz w:val="15"/>
           <w:szCs w:val="15"/>
         </w:rPr>
@@ -4691,14 +4691,14 @@
         <w:jc w:val="left"/>
         <w:widowControl w:val="0"/>
         <w:rPr>
-          <w:rFonts w:ascii="Big Caslon" w:hAnsi="Big Caslon" w:eastAsia="Big Caslon" w:cs="Big Caslon"/>
-          <w:sz w:val="15"/>
-          <w:szCs w:val="15"/>
-        </w:rPr>
-      </w:pPr>
-      <w:r>
-        <w:rPr>
-          <w:rFonts w:ascii="Big Caslon" w:hAnsi="Big Caslon" w:eastAsia="Big Caslon" w:cs="Big Caslon"/>
+          <w:rFonts w:ascii="Big Caslon Medium" w:hAnsi="Big Caslon Medium" w:eastAsia="Big Caslon Medium" w:cs="Big Caslon Medium"/>
+          <w:sz w:val="15"/>
+          <w:szCs w:val="15"/>
+        </w:rPr>
+      </w:pPr>
+      <w:r>
+        <w:rPr>
+          <w:rFonts w:ascii="Big Caslon Medium" w:hAnsi="Big Caslon Medium" w:eastAsia="Big Caslon Medium" w:cs="Big Caslon Medium"/>
           <w:sz w:val="15"/>
           <w:szCs w:val="15"/>
         </w:rPr>
@@ -4711,14 +4711,14 @@
         <w:jc w:val="left"/>
         <w:widowControl w:val="0"/>
         <w:rPr>
-          <w:rFonts w:ascii="Big Caslon" w:hAnsi="Big Caslon" w:eastAsia="Big Caslon" w:cs="Big Caslon"/>
-          <w:sz w:val="15"/>
-          <w:szCs w:val="15"/>
-        </w:rPr>
-      </w:pPr>
-      <w:r>
-        <w:rPr>
-          <w:rFonts w:ascii="Big Caslon" w:hAnsi="Big Caslon" w:eastAsia="Big Caslon" w:cs="Big Caslon"/>
+          <w:rFonts w:ascii="Big Caslon Medium" w:hAnsi="Big Caslon Medium" w:eastAsia="Big Caslon Medium" w:cs="Big Caslon Medium"/>
+          <w:sz w:val="15"/>
+          <w:szCs w:val="15"/>
+        </w:rPr>
+      </w:pPr>
+      <w:r>
+        <w:rPr>
+          <w:rFonts w:ascii="Big Caslon Medium" w:hAnsi="Big Caslon Medium" w:eastAsia="Big Caslon Medium" w:cs="Big Caslon Medium"/>
           <w:sz w:val="15"/>
           <w:szCs w:val="15"/>
         </w:rPr>
@@ -4731,14 +4731,14 @@
         <w:jc w:val="left"/>
         <w:widowControl w:val="0"/>
         <w:rPr>
-          <w:rFonts w:ascii="Big Caslon" w:hAnsi="Big Caslon" w:eastAsia="Big Caslon" w:cs="Big Caslon"/>
-          <w:sz w:val="15"/>
-          <w:szCs w:val="15"/>
-        </w:rPr>
-      </w:pPr>
-      <w:r>
-        <w:rPr>
-          <w:rFonts w:ascii="Big Caslon" w:hAnsi="Big Caslon" w:eastAsia="Big Caslon" w:cs="Big Caslon"/>
+          <w:rFonts w:ascii="Big Caslon Medium" w:hAnsi="Big Caslon Medium" w:eastAsia="Big Caslon Medium" w:cs="Big Caslon Medium"/>
+          <w:sz w:val="15"/>
+          <w:szCs w:val="15"/>
+        </w:rPr>
+      </w:pPr>
+      <w:r>
+        <w:rPr>
+          <w:rFonts w:ascii="Big Caslon Medium" w:hAnsi="Big Caslon Medium" w:eastAsia="Big Caslon Medium" w:cs="Big Caslon Medium"/>
           <w:sz w:val="15"/>
           <w:szCs w:val="15"/>
         </w:rPr>
@@ -4751,14 +4751,14 @@
         <w:jc w:val="left"/>
         <w:widowControl w:val="0"/>
         <w:rPr>
-          <w:rFonts w:ascii="Big Caslon" w:hAnsi="Big Caslon" w:eastAsia="Big Caslon" w:cs="Big Caslon"/>
-          <w:sz w:val="15"/>
-          <w:szCs w:val="15"/>
-        </w:rPr>
-      </w:pPr>
-      <w:r>
-        <w:rPr>
-          <w:rFonts w:ascii="Big Caslon" w:hAnsi="Big Caslon" w:eastAsia="Big Caslon" w:cs="Big Caslon"/>
+          <w:rFonts w:ascii="Big Caslon Medium" w:hAnsi="Big Caslon Medium" w:eastAsia="Big Caslon Medium" w:cs="Big Caslon Medium"/>
+          <w:sz w:val="15"/>
+          <w:szCs w:val="15"/>
+        </w:rPr>
+      </w:pPr>
+      <w:r>
+        <w:rPr>
+          <w:rFonts w:ascii="Big Caslon Medium" w:hAnsi="Big Caslon Medium" w:eastAsia="Big Caslon Medium" w:cs="Big Caslon Medium"/>
           <w:sz w:val="15"/>
           <w:szCs w:val="15"/>
         </w:rPr>
@@ -4771,14 +4771,14 @@
         <w:jc w:val="left"/>
         <w:widowControl w:val="0"/>
         <w:rPr>
-          <w:rFonts w:ascii="Big Caslon" w:hAnsi="Big Caslon" w:eastAsia="Big Caslon" w:cs="Big Caslon"/>
-          <w:sz w:val="15"/>
-          <w:szCs w:val="15"/>
-        </w:rPr>
-      </w:pPr>
-      <w:r>
-        <w:rPr>
-          <w:rFonts w:ascii="Big Caslon" w:hAnsi="Big Caslon" w:eastAsia="Big Caslon" w:cs="Big Caslon"/>
+          <w:rFonts w:ascii="Big Caslon Medium" w:hAnsi="Big Caslon Medium" w:eastAsia="Big Caslon Medium" w:cs="Big Caslon Medium"/>
+          <w:sz w:val="15"/>
+          <w:szCs w:val="15"/>
+        </w:rPr>
+      </w:pPr>
+      <w:r>
+        <w:rPr>
+          <w:rFonts w:ascii="Big Caslon Medium" w:hAnsi="Big Caslon Medium" w:eastAsia="Big Caslon Medium" w:cs="Big Caslon Medium"/>
           <w:sz w:val="15"/>
           <w:szCs w:val="15"/>
         </w:rPr>
@@ -4791,14 +4791,14 @@
         <w:jc w:val="left"/>
         <w:widowControl w:val="0"/>
         <w:rPr>
-          <w:rFonts w:ascii="Big Caslon" w:hAnsi="Big Caslon" w:eastAsia="Big Caslon" w:cs="Big Caslon"/>
-          <w:sz w:val="15"/>
-          <w:szCs w:val="15"/>
-        </w:rPr>
-      </w:pPr>
-      <w:r>
-        <w:rPr>
-          <w:rFonts w:ascii="Big Caslon" w:hAnsi="Big Caslon" w:eastAsia="Big Caslon" w:cs="Big Caslon"/>
+          <w:rFonts w:ascii="Big Caslon Medium" w:hAnsi="Big Caslon Medium" w:eastAsia="Big Caslon Medium" w:cs="Big Caslon Medium"/>
+          <w:sz w:val="15"/>
+          <w:szCs w:val="15"/>
+        </w:rPr>
+      </w:pPr>
+      <w:r>
+        <w:rPr>
+          <w:rFonts w:ascii="Big Caslon Medium" w:hAnsi="Big Caslon Medium" w:eastAsia="Big Caslon Medium" w:cs="Big Caslon Medium"/>
           <w:sz w:val="15"/>
           <w:szCs w:val="15"/>
         </w:rPr>
@@ -4811,14 +4811,14 @@
         <w:jc w:val="left"/>
         <w:widowControl w:val="0"/>
         <w:rPr>
-          <w:rFonts w:ascii="Big Caslon" w:hAnsi="Big Caslon" w:eastAsia="Big Caslon" w:cs="Big Caslon"/>
-          <w:sz w:val="15"/>
-          <w:szCs w:val="15"/>
-        </w:rPr>
-      </w:pPr>
-      <w:r>
-        <w:rPr>
-          <w:rFonts w:ascii="Big Caslon" w:hAnsi="Big Caslon" w:eastAsia="Big Caslon" w:cs="Big Caslon"/>
+          <w:rFonts w:ascii="Big Caslon Medium" w:hAnsi="Big Caslon Medium" w:eastAsia="Big Caslon Medium" w:cs="Big Caslon Medium"/>
+          <w:sz w:val="15"/>
+          <w:szCs w:val="15"/>
+        </w:rPr>
+      </w:pPr>
+      <w:r>
+        <w:rPr>
+          <w:rFonts w:ascii="Big Caslon Medium" w:hAnsi="Big Caslon Medium" w:eastAsia="Big Caslon Medium" w:cs="Big Caslon Medium"/>
           <w:sz w:val="15"/>
           <w:szCs w:val="15"/>
         </w:rPr>
@@ -4831,14 +4831,14 @@
         <w:jc w:val="left"/>
         <w:widowControl w:val="0"/>
         <w:rPr>
-          <w:rFonts w:ascii="Big Caslon" w:hAnsi="Big Caslon" w:eastAsia="Big Caslon" w:cs="Big Caslon"/>
-          <w:sz w:val="15"/>
-          <w:szCs w:val="15"/>
-        </w:rPr>
-      </w:pPr>
-      <w:r>
-        <w:rPr>
-          <w:rFonts w:ascii="Big Caslon" w:hAnsi="Big Caslon" w:eastAsia="Big Caslon" w:cs="Big Caslon"/>
+          <w:rFonts w:ascii="Big Caslon Medium" w:hAnsi="Big Caslon Medium" w:eastAsia="Big Caslon Medium" w:cs="Big Caslon Medium"/>
+          <w:sz w:val="15"/>
+          <w:szCs w:val="15"/>
+        </w:rPr>
+      </w:pPr>
+      <w:r>
+        <w:rPr>
+          <w:rFonts w:ascii="Big Caslon Medium" w:hAnsi="Big Caslon Medium" w:eastAsia="Big Caslon Medium" w:cs="Big Caslon Medium"/>
           <w:sz w:val="15"/>
           <w:szCs w:val="15"/>
         </w:rPr>
@@ -4851,14 +4851,14 @@
         <w:jc w:val="left"/>
         <w:widowControl w:val="0"/>
         <w:rPr>
-          <w:rFonts w:ascii="Big Caslon" w:hAnsi="Big Caslon" w:eastAsia="Big Caslon" w:cs="Big Caslon"/>
-          <w:sz w:val="15"/>
-          <w:szCs w:val="15"/>
-        </w:rPr>
-      </w:pPr>
-      <w:r>
-        <w:rPr>
-          <w:rFonts w:ascii="Big Caslon" w:hAnsi="Big Caslon" w:eastAsia="Big Caslon" w:cs="Big Caslon"/>
+          <w:rFonts w:ascii="Big Caslon Medium" w:hAnsi="Big Caslon Medium" w:eastAsia="Big Caslon Medium" w:cs="Big Caslon Medium"/>
+          <w:sz w:val="15"/>
+          <w:szCs w:val="15"/>
+        </w:rPr>
+      </w:pPr>
+      <w:r>
+        <w:rPr>
+          <w:rFonts w:ascii="Big Caslon Medium" w:hAnsi="Big Caslon Medium" w:eastAsia="Big Caslon Medium" w:cs="Big Caslon Medium"/>
           <w:sz w:val="15"/>
           <w:szCs w:val="15"/>
         </w:rPr>
@@ -4871,14 +4871,14 @@
         <w:jc w:val="left"/>
         <w:widowControl w:val="0"/>
         <w:rPr>
-          <w:rFonts w:ascii="Big Caslon" w:hAnsi="Big Caslon" w:eastAsia="Big Caslon" w:cs="Big Caslon"/>
-          <w:sz w:val="15"/>
-          <w:szCs w:val="15"/>
-        </w:rPr>
-      </w:pPr>
-      <w:r>
-        <w:rPr>
-          <w:rFonts w:ascii="Big Caslon" w:hAnsi="Big Caslon" w:eastAsia="Big Caslon" w:cs="Big Caslon"/>
+          <w:rFonts w:ascii="Big Caslon Medium" w:hAnsi="Big Caslon Medium" w:eastAsia="Big Caslon Medium" w:cs="Big Caslon Medium"/>
+          <w:sz w:val="15"/>
+          <w:szCs w:val="15"/>
+        </w:rPr>
+      </w:pPr>
+      <w:r>
+        <w:rPr>
+          <w:rFonts w:ascii="Big Caslon Medium" w:hAnsi="Big Caslon Medium" w:eastAsia="Big Caslon Medium" w:cs="Big Caslon Medium"/>
           <w:sz w:val="15"/>
           <w:szCs w:val="15"/>
         </w:rPr>
@@ -4891,14 +4891,14 @@
         <w:jc w:val="left"/>
         <w:widowControl w:val="0"/>
         <w:rPr>
-          <w:rFonts w:ascii="Big Caslon" w:hAnsi="Big Caslon" w:eastAsia="Big Caslon" w:cs="Big Caslon"/>
-          <w:sz w:val="15"/>
-          <w:szCs w:val="15"/>
-        </w:rPr>
-      </w:pPr>
-      <w:r>
-        <w:rPr>
-          <w:rFonts w:ascii="Big Caslon" w:hAnsi="Big Caslon" w:eastAsia="Big Caslon" w:cs="Big Caslon"/>
+          <w:rFonts w:ascii="Big Caslon Medium" w:hAnsi="Big Caslon Medium" w:eastAsia="Big Caslon Medium" w:cs="Big Caslon Medium"/>
+          <w:sz w:val="15"/>
+          <w:szCs w:val="15"/>
+        </w:rPr>
+      </w:pPr>
+      <w:r>
+        <w:rPr>
+          <w:rFonts w:ascii="Big Caslon Medium" w:hAnsi="Big Caslon Medium" w:eastAsia="Big Caslon Medium" w:cs="Big Caslon Medium"/>
           <w:sz w:val="15"/>
           <w:szCs w:val="15"/>
         </w:rPr>
@@ -4911,14 +4911,14 @@
         <w:jc w:val="left"/>
         <w:widowControl w:val="0"/>
         <w:rPr>
-          <w:rFonts w:ascii="Big Caslon" w:hAnsi="Big Caslon" w:eastAsia="Big Caslon" w:cs="Big Caslon"/>
-          <w:sz w:val="15"/>
-          <w:szCs w:val="15"/>
-        </w:rPr>
-      </w:pPr>
-      <w:r>
-        <w:rPr>
-          <w:rFonts w:ascii="Big Caslon" w:hAnsi="Big Caslon" w:eastAsia="Big Caslon" w:cs="Big Caslon"/>
+          <w:rFonts w:ascii="Big Caslon Medium" w:hAnsi="Big Caslon Medium" w:eastAsia="Big Caslon Medium" w:cs="Big Caslon Medium"/>
+          <w:sz w:val="15"/>
+          <w:szCs w:val="15"/>
+        </w:rPr>
+      </w:pPr>
+      <w:r>
+        <w:rPr>
+          <w:rFonts w:ascii="Big Caslon Medium" w:hAnsi="Big Caslon Medium" w:eastAsia="Big Caslon Medium" w:cs="Big Caslon Medium"/>
           <w:sz w:val="15"/>
           <w:szCs w:val="15"/>
         </w:rPr>
@@ -4931,14 +4931,14 @@
         <w:jc w:val="left"/>
         <w:widowControl w:val="0"/>
         <w:rPr>
-          <w:rFonts w:ascii="Big Caslon" w:hAnsi="Big Caslon" w:eastAsia="Big Caslon" w:cs="Big Caslon"/>
-          <w:sz w:val="15"/>
-          <w:szCs w:val="15"/>
-        </w:rPr>
-      </w:pPr>
-      <w:r>
-        <w:rPr>
-          <w:rFonts w:ascii="Big Caslon" w:hAnsi="Big Caslon" w:eastAsia="Big Caslon" w:cs="Big Caslon"/>
+          <w:rFonts w:ascii="Big Caslon Medium" w:hAnsi="Big Caslon Medium" w:eastAsia="Big Caslon Medium" w:cs="Big Caslon Medium"/>
+          <w:sz w:val="15"/>
+          <w:szCs w:val="15"/>
+        </w:rPr>
+      </w:pPr>
+      <w:r>
+        <w:rPr>
+          <w:rFonts w:ascii="Big Caslon Medium" w:hAnsi="Big Caslon Medium" w:eastAsia="Big Caslon Medium" w:cs="Big Caslon Medium"/>
           <w:sz w:val="15"/>
           <w:szCs w:val="15"/>
         </w:rPr>
@@ -4951,14 +4951,14 @@
         <w:jc w:val="left"/>
         <w:widowControl w:val="0"/>
         <w:rPr>
-          <w:rFonts w:ascii="Big Caslon" w:hAnsi="Big Caslon" w:eastAsia="Big Caslon" w:cs="Big Caslon"/>
-          <w:sz w:val="15"/>
-          <w:szCs w:val="15"/>
-        </w:rPr>
-      </w:pPr>
-      <w:r>
-        <w:rPr>
-          <w:rFonts w:ascii="Big Caslon" w:hAnsi="Big Caslon" w:eastAsia="Big Caslon" w:cs="Big Caslon"/>
+          <w:rFonts w:ascii="Big Caslon Medium" w:hAnsi="Big Caslon Medium" w:eastAsia="Big Caslon Medium" w:cs="Big Caslon Medium"/>
+          <w:sz w:val="15"/>
+          <w:szCs w:val="15"/>
+        </w:rPr>
+      </w:pPr>
+      <w:r>
+        <w:rPr>
+          <w:rFonts w:ascii="Big Caslon Medium" w:hAnsi="Big Caslon Medium" w:eastAsia="Big Caslon Medium" w:cs="Big Caslon Medium"/>
           <w:sz w:val="15"/>
           <w:szCs w:val="15"/>
         </w:rPr>
@@ -4971,14 +4971,14 @@
         <w:jc w:val="left"/>
         <w:widowControl w:val="0"/>
         <w:rPr>
-          <w:rFonts w:ascii="Big Caslon" w:hAnsi="Big Caslon" w:eastAsia="Big Caslon" w:cs="Big Caslon"/>
-          <w:sz w:val="15"/>
-          <w:szCs w:val="15"/>
-        </w:rPr>
-      </w:pPr>
-      <w:r>
-        <w:rPr>
-          <w:rFonts w:ascii="Big Caslon" w:hAnsi="Big Caslon" w:eastAsia="Big Caslon" w:cs="Big Caslon"/>
+          <w:rFonts w:ascii="Big Caslon Medium" w:hAnsi="Big Caslon Medium" w:eastAsia="Big Caslon Medium" w:cs="Big Caslon Medium"/>
+          <w:sz w:val="15"/>
+          <w:szCs w:val="15"/>
+        </w:rPr>
+      </w:pPr>
+      <w:r>
+        <w:rPr>
+          <w:rFonts w:ascii="Big Caslon Medium" w:hAnsi="Big Caslon Medium" w:eastAsia="Big Caslon Medium" w:cs="Big Caslon Medium"/>
           <w:sz w:val="15"/>
           <w:szCs w:val="15"/>
         </w:rPr>
@@ -4991,14 +4991,14 @@
         <w:jc w:val="left"/>
         <w:widowControl w:val="0"/>
         <w:rPr>
-          <w:rFonts w:ascii="Big Caslon" w:hAnsi="Big Caslon" w:eastAsia="Big Caslon" w:cs="Big Caslon"/>
-          <w:sz w:val="15"/>
-          <w:szCs w:val="15"/>
-        </w:rPr>
-      </w:pPr>
-      <w:r>
-        <w:rPr>
-          <w:rFonts w:ascii="Big Caslon" w:hAnsi="Big Caslon" w:eastAsia="Big Caslon" w:cs="Big Caslon"/>
+          <w:rFonts w:ascii="Big Caslon Medium" w:hAnsi="Big Caslon Medium" w:eastAsia="Big Caslon Medium" w:cs="Big Caslon Medium"/>
+          <w:sz w:val="15"/>
+          <w:szCs w:val="15"/>
+        </w:rPr>
+      </w:pPr>
+      <w:r>
+        <w:rPr>
+          <w:rFonts w:ascii="Big Caslon Medium" w:hAnsi="Big Caslon Medium" w:eastAsia="Big Caslon Medium" w:cs="Big Caslon Medium"/>
           <w:sz w:val="15"/>
           <w:szCs w:val="15"/>
         </w:rPr>
@@ -5011,14 +5011,14 @@
         <w:jc w:val="left"/>
         <w:widowControl w:val="0"/>
         <w:rPr>
-          <w:rFonts w:ascii="Big Caslon" w:hAnsi="Big Caslon" w:eastAsia="Big Caslon" w:cs="Big Caslon"/>
-          <w:sz w:val="15"/>
-          <w:szCs w:val="15"/>
-        </w:rPr>
-      </w:pPr>
-      <w:r>
-        <w:rPr>
-          <w:rFonts w:ascii="Big Caslon" w:hAnsi="Big Caslon" w:eastAsia="Big Caslon" w:cs="Big Caslon"/>
+          <w:rFonts w:ascii="Big Caslon Medium" w:hAnsi="Big Caslon Medium" w:eastAsia="Big Caslon Medium" w:cs="Big Caslon Medium"/>
+          <w:sz w:val="15"/>
+          <w:szCs w:val="15"/>
+        </w:rPr>
+      </w:pPr>
+      <w:r>
+        <w:rPr>
+          <w:rFonts w:ascii="Big Caslon Medium" w:hAnsi="Big Caslon Medium" w:eastAsia="Big Caslon Medium" w:cs="Big Caslon Medium"/>
           <w:sz w:val="15"/>
           <w:szCs w:val="15"/>
         </w:rPr>
@@ -5031,14 +5031,14 @@
         <w:jc w:val="left"/>
         <w:widowControl w:val="0"/>
         <w:rPr>
-          <w:rFonts w:ascii="Big Caslon" w:hAnsi="Big Caslon" w:eastAsia="Big Caslon" w:cs="Big Caslon"/>
-          <w:sz w:val="15"/>
-          <w:szCs w:val="15"/>
-        </w:rPr>
-      </w:pPr>
-      <w:r>
-        <w:rPr>
-          <w:rFonts w:ascii="Big Caslon" w:hAnsi="Big Caslon" w:eastAsia="Big Caslon" w:cs="Big Caslon"/>
+          <w:rFonts w:ascii="Big Caslon Medium" w:hAnsi="Big Caslon Medium" w:eastAsia="Big Caslon Medium" w:cs="Big Caslon Medium"/>
+          <w:sz w:val="15"/>
+          <w:szCs w:val="15"/>
+        </w:rPr>
+      </w:pPr>
+      <w:r>
+        <w:rPr>
+          <w:rFonts w:ascii="Big Caslon Medium" w:hAnsi="Big Caslon Medium" w:eastAsia="Big Caslon Medium" w:cs="Big Caslon Medium"/>
           <w:sz w:val="15"/>
           <w:szCs w:val="15"/>
         </w:rPr>
@@ -5051,14 +5051,14 @@
         <w:jc w:val="left"/>
         <w:widowControl w:val="0"/>
         <w:rPr>
-          <w:rFonts w:ascii="Big Caslon" w:hAnsi="Big Caslon" w:eastAsia="Big Caslon" w:cs="Big Caslon"/>
-          <w:sz w:val="15"/>
-          <w:szCs w:val="15"/>
-        </w:rPr>
-      </w:pPr>
-      <w:r>
-        <w:rPr>
-          <w:rFonts w:ascii="Big Caslon" w:hAnsi="Big Caslon" w:eastAsia="Big Caslon" w:cs="Big Caslon"/>
+          <w:rFonts w:ascii="Big Caslon Medium" w:hAnsi="Big Caslon Medium" w:eastAsia="Big Caslon Medium" w:cs="Big Caslon Medium"/>
+          <w:sz w:val="15"/>
+          <w:szCs w:val="15"/>
+        </w:rPr>
+      </w:pPr>
+      <w:r>
+        <w:rPr>
+          <w:rFonts w:ascii="Big Caslon Medium" w:hAnsi="Big Caslon Medium" w:eastAsia="Big Caslon Medium" w:cs="Big Caslon Medium"/>
           <w:sz w:val="15"/>
           <w:szCs w:val="15"/>
         </w:rPr>
@@ -5071,14 +5071,14 @@
         <w:jc w:val="left"/>
         <w:widowControl w:val="0"/>
         <w:rPr>
-          <w:rFonts w:ascii="Big Caslon" w:hAnsi="Big Caslon" w:eastAsia="Big Caslon" w:cs="Big Caslon"/>
-          <w:sz w:val="15"/>
-          <w:szCs w:val="15"/>
-        </w:rPr>
-      </w:pPr>
-      <w:r>
-        <w:rPr>
-          <w:rFonts w:ascii="Big Caslon" w:hAnsi="Big Caslon" w:eastAsia="Big Caslon" w:cs="Big Caslon"/>
+          <w:rFonts w:ascii="Big Caslon Medium" w:hAnsi="Big Caslon Medium" w:eastAsia="Big Caslon Medium" w:cs="Big Caslon Medium"/>
+          <w:sz w:val="15"/>
+          <w:szCs w:val="15"/>
+        </w:rPr>
+      </w:pPr>
+      <w:r>
+        <w:rPr>
+          <w:rFonts w:ascii="Big Caslon Medium" w:hAnsi="Big Caslon Medium" w:eastAsia="Big Caslon Medium" w:cs="Big Caslon Medium"/>
           <w:sz w:val="15"/>
           <w:szCs w:val="15"/>
         </w:rPr>
@@ -5091,14 +5091,14 @@
         <w:jc w:val="left"/>
         <w:widowControl w:val="0"/>
         <w:rPr>
-          <w:rFonts w:ascii="Big Caslon" w:hAnsi="Big Caslon" w:eastAsia="Big Caslon" w:cs="Big Caslon"/>
-          <w:sz w:val="15"/>
-          <w:szCs w:val="15"/>
-        </w:rPr>
-      </w:pPr>
-      <w:r>
-        <w:rPr>
-          <w:rFonts w:ascii="Big Caslon" w:hAnsi="Big Caslon" w:eastAsia="Big Caslon" w:cs="Big Caslon"/>
+          <w:rFonts w:ascii="Big Caslon Medium" w:hAnsi="Big Caslon Medium" w:eastAsia="Big Caslon Medium" w:cs="Big Caslon Medium"/>
+          <w:sz w:val="15"/>
+          <w:szCs w:val="15"/>
+        </w:rPr>
+      </w:pPr>
+      <w:r>
+        <w:rPr>
+          <w:rFonts w:ascii="Big Caslon Medium" w:hAnsi="Big Caslon Medium" w:eastAsia="Big Caslon Medium" w:cs="Big Caslon Medium"/>
           <w:sz w:val="15"/>
           <w:szCs w:val="15"/>
         </w:rPr>
@@ -5111,14 +5111,14 @@
         <w:jc w:val="left"/>
         <w:widowControl w:val="0"/>
         <w:rPr>
-          <w:rFonts w:ascii="Big Caslon" w:hAnsi="Big Caslon" w:eastAsia="Big Caslon" w:cs="Big Caslon"/>
-          <w:sz w:val="15"/>
-          <w:szCs w:val="15"/>
-        </w:rPr>
-      </w:pPr>
-      <w:r>
-        <w:rPr>
-          <w:rFonts w:ascii="Big Caslon" w:hAnsi="Big Caslon" w:eastAsia="Big Caslon" w:cs="Big Caslon"/>
+          <w:rFonts w:ascii="Big Caslon Medium" w:hAnsi="Big Caslon Medium" w:eastAsia="Big Caslon Medium" w:cs="Big Caslon Medium"/>
+          <w:sz w:val="15"/>
+          <w:szCs w:val="15"/>
+        </w:rPr>
+      </w:pPr>
+      <w:r>
+        <w:rPr>
+          <w:rFonts w:ascii="Big Caslon Medium" w:hAnsi="Big Caslon Medium" w:eastAsia="Big Caslon Medium" w:cs="Big Caslon Medium"/>
           <w:sz w:val="15"/>
           <w:szCs w:val="15"/>
         </w:rPr>
@@ -5131,14 +5131,14 @@
         <w:jc w:val="left"/>
         <w:widowControl w:val="0"/>
         <w:rPr>
-          <w:rFonts w:ascii="Big Caslon" w:hAnsi="Big Caslon" w:eastAsia="Big Caslon" w:cs="Big Caslon"/>
-          <w:sz w:val="15"/>
-          <w:szCs w:val="15"/>
-        </w:rPr>
-      </w:pPr>
-      <w:r>
-        <w:rPr>
-          <w:rFonts w:ascii="Big Caslon" w:hAnsi="Big Caslon" w:eastAsia="Big Caslon" w:cs="Big Caslon"/>
+          <w:rFonts w:ascii="Big Caslon Medium" w:hAnsi="Big Caslon Medium" w:eastAsia="Big Caslon Medium" w:cs="Big Caslon Medium"/>
+          <w:sz w:val="15"/>
+          <w:szCs w:val="15"/>
+        </w:rPr>
+      </w:pPr>
+      <w:r>
+        <w:rPr>
+          <w:rFonts w:ascii="Big Caslon Medium" w:hAnsi="Big Caslon Medium" w:eastAsia="Big Caslon Medium" w:cs="Big Caslon Medium"/>
           <w:sz w:val="15"/>
           <w:szCs w:val="15"/>
         </w:rPr>
@@ -5151,14 +5151,14 @@
         <w:jc w:val="left"/>
         <w:widowControl w:val="0"/>
         <w:rPr>
-          <w:rFonts w:ascii="Big Caslon" w:hAnsi="Big Caslon" w:eastAsia="Big Caslon" w:cs="Big Caslon"/>
-          <w:sz w:val="15"/>
-          <w:szCs w:val="15"/>
-        </w:rPr>
-      </w:pPr>
-      <w:r>
-        <w:rPr>
-          <w:rFonts w:ascii="Big Caslon" w:hAnsi="Big Caslon" w:eastAsia="Big Caslon" w:cs="Big Caslon"/>
+          <w:rFonts w:ascii="Big Caslon Medium" w:hAnsi="Big Caslon Medium" w:eastAsia="Big Caslon Medium" w:cs="Big Caslon Medium"/>
+          <w:sz w:val="15"/>
+          <w:szCs w:val="15"/>
+        </w:rPr>
+      </w:pPr>
+      <w:r>
+        <w:rPr>
+          <w:rFonts w:ascii="Big Caslon Medium" w:hAnsi="Big Caslon Medium" w:eastAsia="Big Caslon Medium" w:cs="Big Caslon Medium"/>
           <w:sz w:val="15"/>
           <w:szCs w:val="15"/>
         </w:rPr>
@@ -5171,14 +5171,14 @@
         <w:jc w:val="left"/>
         <w:widowControl w:val="0"/>
         <w:rPr>
-          <w:rFonts w:ascii="Big Caslon" w:hAnsi="Big Caslon" w:eastAsia="Big Caslon" w:cs="Big Caslon"/>
-          <w:sz w:val="15"/>
-          <w:szCs w:val="15"/>
-        </w:rPr>
-      </w:pPr>
-      <w:r>
-        <w:rPr>
-          <w:rFonts w:ascii="Big Caslon" w:hAnsi="Big Caslon" w:eastAsia="Big Caslon" w:cs="Big Caslon"/>
+          <w:rFonts w:ascii="Big Caslon Medium" w:hAnsi="Big Caslon Medium" w:eastAsia="Big Caslon Medium" w:cs="Big Caslon Medium"/>
+          <w:sz w:val="15"/>
+          <w:szCs w:val="15"/>
+        </w:rPr>
+      </w:pPr>
+      <w:r>
+        <w:rPr>
+          <w:rFonts w:ascii="Big Caslon Medium" w:hAnsi="Big Caslon Medium" w:eastAsia="Big Caslon Medium" w:cs="Big Caslon Medium"/>
           <w:sz w:val="15"/>
           <w:szCs w:val="15"/>
         </w:rPr>
@@ -5191,14 +5191,14 @@
         <w:jc w:val="left"/>
         <w:widowControl w:val="0"/>
         <w:rPr>
-          <w:rFonts w:ascii="Big Caslon" w:hAnsi="Big Caslon" w:eastAsia="Big Caslon" w:cs="Big Caslon"/>
-          <w:sz w:val="15"/>
-          <w:szCs w:val="15"/>
-        </w:rPr>
-      </w:pPr>
-      <w:r>
-        <w:rPr>
-          <w:rFonts w:ascii="Big Caslon" w:hAnsi="Big Caslon" w:eastAsia="Big Caslon" w:cs="Big Caslon"/>
+          <w:rFonts w:ascii="Big Caslon Medium" w:hAnsi="Big Caslon Medium" w:eastAsia="Big Caslon Medium" w:cs="Big Caslon Medium"/>
+          <w:sz w:val="15"/>
+          <w:szCs w:val="15"/>
+        </w:rPr>
+      </w:pPr>
+      <w:r>
+        <w:rPr>
+          <w:rFonts w:ascii="Big Caslon Medium" w:hAnsi="Big Caslon Medium" w:eastAsia="Big Caslon Medium" w:cs="Big Caslon Medium"/>
           <w:sz w:val="15"/>
           <w:szCs w:val="15"/>
         </w:rPr>
@@ -5211,14 +5211,14 @@
         <w:jc w:val="left"/>
         <w:widowControl w:val="0"/>
         <w:rPr>
-          <w:rFonts w:ascii="Big Caslon" w:hAnsi="Big Caslon" w:eastAsia="Big Caslon" w:cs="Big Caslon"/>
-          <w:sz w:val="15"/>
-          <w:szCs w:val="15"/>
-        </w:rPr>
-      </w:pPr>
-      <w:r>
-        <w:rPr>
-          <w:rFonts w:ascii="Big Caslon" w:hAnsi="Big Caslon" w:eastAsia="Big Caslon" w:cs="Big Caslon"/>
+          <w:rFonts w:ascii="Big Caslon Medium" w:hAnsi="Big Caslon Medium" w:eastAsia="Big Caslon Medium" w:cs="Big Caslon Medium"/>
+          <w:sz w:val="15"/>
+          <w:szCs w:val="15"/>
+        </w:rPr>
+      </w:pPr>
+      <w:r>
+        <w:rPr>
+          <w:rFonts w:ascii="Big Caslon Medium" w:hAnsi="Big Caslon Medium" w:eastAsia="Big Caslon Medium" w:cs="Big Caslon Medium"/>
           <w:sz w:val="15"/>
           <w:szCs w:val="15"/>
         </w:rPr>
@@ -5231,14 +5231,14 @@
         <w:jc w:val="left"/>
         <w:widowControl w:val="0"/>
         <w:rPr>
-          <w:rFonts w:ascii="Big Caslon" w:hAnsi="Big Caslon" w:eastAsia="Big Caslon" w:cs="Big Caslon"/>
-          <w:sz w:val="15"/>
-          <w:szCs w:val="15"/>
-        </w:rPr>
-      </w:pPr>
-      <w:r>
-        <w:rPr>
-          <w:rFonts w:ascii="Big Caslon" w:hAnsi="Big Caslon" w:eastAsia="Big Caslon" w:cs="Big Caslon"/>
+          <w:rFonts w:ascii="Big Caslon Medium" w:hAnsi="Big Caslon Medium" w:eastAsia="Big Caslon Medium" w:cs="Big Caslon Medium"/>
+          <w:sz w:val="15"/>
+          <w:szCs w:val="15"/>
+        </w:rPr>
+      </w:pPr>
+      <w:r>
+        <w:rPr>
+          <w:rFonts w:ascii="Big Caslon Medium" w:hAnsi="Big Caslon Medium" w:eastAsia="Big Caslon Medium" w:cs="Big Caslon Medium"/>
           <w:sz w:val="15"/>
           <w:szCs w:val="15"/>
         </w:rPr>
@@ -5251,14 +5251,14 @@
         <w:jc w:val="left"/>
         <w:widowControl w:val="0"/>
         <w:rPr>
-          <w:rFonts w:ascii="Big Caslon" w:hAnsi="Big Caslon" w:eastAsia="Big Caslon" w:cs="Big Caslon"/>
-          <w:sz w:val="15"/>
-          <w:szCs w:val="15"/>
-        </w:rPr>
-      </w:pPr>
-      <w:r>
-        <w:rPr>
-          <w:rFonts w:ascii="Big Caslon" w:hAnsi="Big Caslon" w:eastAsia="Big Caslon" w:cs="Big Caslon"/>
+          <w:rFonts w:ascii="Big Caslon Medium" w:hAnsi="Big Caslon Medium" w:eastAsia="Big Caslon Medium" w:cs="Big Caslon Medium"/>
+          <w:sz w:val="15"/>
+          <w:szCs w:val="15"/>
+        </w:rPr>
+      </w:pPr>
+      <w:r>
+        <w:rPr>
+          <w:rFonts w:ascii="Big Caslon Medium" w:hAnsi="Big Caslon Medium" w:eastAsia="Big Caslon Medium" w:cs="Big Caslon Medium"/>
           <w:sz w:val="15"/>
           <w:szCs w:val="15"/>
         </w:rPr>
@@ -5271,14 +5271,14 @@
         <w:jc w:val="left"/>
         <w:widowControl w:val="0"/>
         <w:rPr>
-          <w:rFonts w:ascii="Big Caslon" w:hAnsi="Big Caslon" w:eastAsia="Big Caslon" w:cs="Big Caslon"/>
-          <w:sz w:val="15"/>
-          <w:szCs w:val="15"/>
-        </w:rPr>
-      </w:pPr>
-      <w:r>
-        <w:rPr>
-          <w:rFonts w:ascii="Big Caslon" w:hAnsi="Big Caslon" w:eastAsia="Big Caslon" w:cs="Big Caslon"/>
+          <w:rFonts w:ascii="Big Caslon Medium" w:hAnsi="Big Caslon Medium" w:eastAsia="Big Caslon Medium" w:cs="Big Caslon Medium"/>
+          <w:sz w:val="15"/>
+          <w:szCs w:val="15"/>
+        </w:rPr>
+      </w:pPr>
+      <w:r>
+        <w:rPr>
+          <w:rFonts w:ascii="Big Caslon Medium" w:hAnsi="Big Caslon Medium" w:eastAsia="Big Caslon Medium" w:cs="Big Caslon Medium"/>
           <w:sz w:val="15"/>
           <w:szCs w:val="15"/>
         </w:rPr>
@@ -5291,14 +5291,14 @@
         <w:jc w:val="left"/>
         <w:widowControl w:val="0"/>
         <w:rPr>
-          <w:rFonts w:ascii="Big Caslon" w:hAnsi="Big Caslon" w:eastAsia="Big Caslon" w:cs="Big Caslon"/>
-          <w:sz w:val="15"/>
-          <w:szCs w:val="15"/>
-        </w:rPr>
-      </w:pPr>
-      <w:r>
-        <w:rPr>
-          <w:rFonts w:ascii="Big Caslon" w:hAnsi="Big Caslon" w:eastAsia="Big Caslon" w:cs="Big Caslon"/>
+          <w:rFonts w:ascii="Big Caslon Medium" w:hAnsi="Big Caslon Medium" w:eastAsia="Big Caslon Medium" w:cs="Big Caslon Medium"/>
+          <w:sz w:val="15"/>
+          <w:szCs w:val="15"/>
+        </w:rPr>
+      </w:pPr>
+      <w:r>
+        <w:rPr>
+          <w:rFonts w:ascii="Big Caslon Medium" w:hAnsi="Big Caslon Medium" w:eastAsia="Big Caslon Medium" w:cs="Big Caslon Medium"/>
           <w:sz w:val="15"/>
           <w:szCs w:val="15"/>
         </w:rPr>
@@ -5311,14 +5311,14 @@
         <w:jc w:val="left"/>
         <w:widowControl w:val="0"/>
         <w:rPr>
-          <w:rFonts w:ascii="Big Caslon" w:hAnsi="Big Caslon" w:eastAsia="Big Caslon" w:cs="Big Caslon"/>
-          <w:sz w:val="15"/>
-          <w:szCs w:val="15"/>
-        </w:rPr>
-      </w:pPr>
-      <w:r>
-        <w:rPr>
-          <w:rFonts w:ascii="Big Caslon" w:hAnsi="Big Caslon" w:eastAsia="Big Caslon" w:cs="Big Caslon"/>
+          <w:rFonts w:ascii="Big Caslon Medium" w:hAnsi="Big Caslon Medium" w:eastAsia="Big Caslon Medium" w:cs="Big Caslon Medium"/>
+          <w:sz w:val="15"/>
+          <w:szCs w:val="15"/>
+        </w:rPr>
+      </w:pPr>
+      <w:r>
+        <w:rPr>
+          <w:rFonts w:ascii="Big Caslon Medium" w:hAnsi="Big Caslon Medium" w:eastAsia="Big Caslon Medium" w:cs="Big Caslon Medium"/>
           <w:sz w:val="15"/>
           <w:szCs w:val="15"/>
         </w:rPr>
@@ -5331,14 +5331,14 @@
         <w:jc w:val="left"/>
         <w:widowControl w:val="0"/>
         <w:rPr>
-          <w:rFonts w:ascii="Big Caslon" w:hAnsi="Big Caslon" w:eastAsia="Big Caslon" w:cs="Big Caslon"/>
-          <w:sz w:val="15"/>
-          <w:szCs w:val="15"/>
-        </w:rPr>
-      </w:pPr>
-      <w:r>
-        <w:rPr>
-          <w:rFonts w:ascii="Big Caslon" w:hAnsi="Big Caslon" w:eastAsia="Big Caslon" w:cs="Big Caslon"/>
+          <w:rFonts w:ascii="Big Caslon Medium" w:hAnsi="Big Caslon Medium" w:eastAsia="Big Caslon Medium" w:cs="Big Caslon Medium"/>
+          <w:sz w:val="15"/>
+          <w:szCs w:val="15"/>
+        </w:rPr>
+      </w:pPr>
+      <w:r>
+        <w:rPr>
+          <w:rFonts w:ascii="Big Caslon Medium" w:hAnsi="Big Caslon Medium" w:eastAsia="Big Caslon Medium" w:cs="Big Caslon Medium"/>
           <w:sz w:val="15"/>
           <w:szCs w:val="15"/>
         </w:rPr>
@@ -5351,14 +5351,14 @@
         <w:jc w:val="left"/>
         <w:widowControl w:val="0"/>
         <w:rPr>
-          <w:rFonts w:ascii="Big Caslon" w:hAnsi="Big Caslon" w:eastAsia="Big Caslon" w:cs="Big Caslon"/>
-          <w:sz w:val="15"/>
-          <w:szCs w:val="15"/>
-        </w:rPr>
-      </w:pPr>
-      <w:r>
-        <w:rPr>
-          <w:rFonts w:ascii="Big Caslon" w:hAnsi="Big Caslon" w:eastAsia="Big Caslon" w:cs="Big Caslon"/>
+          <w:rFonts w:ascii="Big Caslon Medium" w:hAnsi="Big Caslon Medium" w:eastAsia="Big Caslon Medium" w:cs="Big Caslon Medium"/>
+          <w:sz w:val="15"/>
+          <w:szCs w:val="15"/>
+        </w:rPr>
+      </w:pPr>
+      <w:r>
+        <w:rPr>
+          <w:rFonts w:ascii="Big Caslon Medium" w:hAnsi="Big Caslon Medium" w:eastAsia="Big Caslon Medium" w:cs="Big Caslon Medium"/>
           <w:sz w:val="15"/>
           <w:szCs w:val="15"/>
         </w:rPr>
@@ -5371,14 +5371,14 @@
         <w:jc w:val="left"/>
         <w:widowControl w:val="0"/>
         <w:rPr>
-          <w:rFonts w:ascii="Big Caslon" w:hAnsi="Big Caslon" w:eastAsia="Big Caslon" w:cs="Big Caslon"/>
-          <w:sz w:val="15"/>
-          <w:szCs w:val="15"/>
-        </w:rPr>
-      </w:pPr>
-      <w:r>
-        <w:rPr>
-          <w:rFonts w:ascii="Big Caslon" w:hAnsi="Big Caslon" w:eastAsia="Big Caslon" w:cs="Big Caslon"/>
+          <w:rFonts w:ascii="Big Caslon Medium" w:hAnsi="Big Caslon Medium" w:eastAsia="Big Caslon Medium" w:cs="Big Caslon Medium"/>
+          <w:sz w:val="15"/>
+          <w:szCs w:val="15"/>
+        </w:rPr>
+      </w:pPr>
+      <w:r>
+        <w:rPr>
+          <w:rFonts w:ascii="Big Caslon Medium" w:hAnsi="Big Caslon Medium" w:eastAsia="Big Caslon Medium" w:cs="Big Caslon Medium"/>
           <w:sz w:val="15"/>
           <w:szCs w:val="15"/>
         </w:rPr>
@@ -5391,14 +5391,14 @@
         <w:jc w:val="left"/>
         <w:widowControl w:val="0"/>
         <w:rPr>
-          <w:rFonts w:ascii="Big Caslon" w:hAnsi="Big Caslon" w:eastAsia="Big Caslon" w:cs="Big Caslon"/>
-          <w:sz w:val="15"/>
-          <w:szCs w:val="15"/>
-        </w:rPr>
-      </w:pPr>
-      <w:r>
-        <w:rPr>
-          <w:rFonts w:ascii="Big Caslon" w:hAnsi="Big Caslon" w:eastAsia="Big Caslon" w:cs="Big Caslon"/>
+          <w:rFonts w:ascii="Big Caslon Medium" w:hAnsi="Big Caslon Medium" w:eastAsia="Big Caslon Medium" w:cs="Big Caslon Medium"/>
+          <w:sz w:val="15"/>
+          <w:szCs w:val="15"/>
+        </w:rPr>
+      </w:pPr>
+      <w:r>
+        <w:rPr>
+          <w:rFonts w:ascii="Big Caslon Medium" w:hAnsi="Big Caslon Medium" w:eastAsia="Big Caslon Medium" w:cs="Big Caslon Medium"/>
           <w:sz w:val="15"/>
           <w:szCs w:val="15"/>
         </w:rPr>
@@ -5411,14 +5411,14 @@
         <w:jc w:val="left"/>
         <w:widowControl w:val="0"/>
         <w:rPr>
-          <w:rFonts w:ascii="Big Caslon" w:hAnsi="Big Caslon" w:eastAsia="Big Caslon" w:cs="Big Caslon"/>
-          <w:sz w:val="15"/>
-          <w:szCs w:val="15"/>
-        </w:rPr>
-      </w:pPr>
-      <w:r>
-        <w:rPr>
-          <w:rFonts w:ascii="Big Caslon" w:hAnsi="Big Caslon" w:eastAsia="Big Caslon" w:cs="Big Caslon"/>
+          <w:rFonts w:ascii="Big Caslon Medium" w:hAnsi="Big Caslon Medium" w:eastAsia="Big Caslon Medium" w:cs="Big Caslon Medium"/>
+          <w:sz w:val="15"/>
+          <w:szCs w:val="15"/>
+        </w:rPr>
+      </w:pPr>
+      <w:r>
+        <w:rPr>
+          <w:rFonts w:ascii="Big Caslon Medium" w:hAnsi="Big Caslon Medium" w:eastAsia="Big Caslon Medium" w:cs="Big Caslon Medium"/>
           <w:sz w:val="15"/>
           <w:szCs w:val="15"/>
         </w:rPr>
@@ -5431,14 +5431,14 @@
         <w:jc w:val="left"/>
         <w:widowControl w:val="0"/>
         <w:rPr>
-          <w:rFonts w:ascii="Big Caslon" w:hAnsi="Big Caslon" w:eastAsia="Big Caslon" w:cs="Big Caslon"/>
-          <w:sz w:val="15"/>
-          <w:szCs w:val="15"/>
-        </w:rPr>
-      </w:pPr>
-      <w:r>
-        <w:rPr>
-          <w:rFonts w:ascii="Big Caslon" w:hAnsi="Big Caslon" w:eastAsia="Big Caslon" w:cs="Big Caslon"/>
+          <w:rFonts w:ascii="Big Caslon Medium" w:hAnsi="Big Caslon Medium" w:eastAsia="Big Caslon Medium" w:cs="Big Caslon Medium"/>
+          <w:sz w:val="15"/>
+          <w:szCs w:val="15"/>
+        </w:rPr>
+      </w:pPr>
+      <w:r>
+        <w:rPr>
+          <w:rFonts w:ascii="Big Caslon Medium" w:hAnsi="Big Caslon Medium" w:eastAsia="Big Caslon Medium" w:cs="Big Caslon Medium"/>
           <w:sz w:val="15"/>
           <w:szCs w:val="15"/>
         </w:rPr>
@@ -5451,14 +5451,14 @@
         <w:jc w:val="left"/>
         <w:widowControl w:val="0"/>
         <w:rPr>
-          <w:rFonts w:ascii="Big Caslon" w:hAnsi="Big Caslon" w:eastAsia="Big Caslon" w:cs="Big Caslon"/>
-          <w:sz w:val="15"/>
-          <w:szCs w:val="15"/>
-        </w:rPr>
-      </w:pPr>
-      <w:r>
-        <w:rPr>
-          <w:rFonts w:ascii="Big Caslon" w:hAnsi="Big Caslon" w:eastAsia="Big Caslon" w:cs="Big Caslon"/>
+          <w:rFonts w:ascii="Big Caslon Medium" w:hAnsi="Big Caslon Medium" w:eastAsia="Big Caslon Medium" w:cs="Big Caslon Medium"/>
+          <w:sz w:val="15"/>
+          <w:szCs w:val="15"/>
+        </w:rPr>
+      </w:pPr>
+      <w:r>
+        <w:rPr>
+          <w:rFonts w:ascii="Big Caslon Medium" w:hAnsi="Big Caslon Medium" w:eastAsia="Big Caslon Medium" w:cs="Big Caslon Medium"/>
           <w:sz w:val="15"/>
           <w:szCs w:val="15"/>
         </w:rPr>
@@ -5471,14 +5471,14 @@
         <w:jc w:val="left"/>
         <w:widowControl w:val="0"/>
         <w:rPr>
-          <w:rFonts w:ascii="Big Caslon" w:hAnsi="Big Caslon" w:eastAsia="Big Caslon" w:cs="Big Caslon"/>
-          <w:sz w:val="15"/>
-          <w:szCs w:val="15"/>
-        </w:rPr>
-      </w:pPr>
-      <w:r>
-        <w:rPr>
-          <w:rFonts w:ascii="Big Caslon" w:hAnsi="Big Caslon" w:eastAsia="Big Caslon" w:cs="Big Caslon"/>
+          <w:rFonts w:ascii="Big Caslon Medium" w:hAnsi="Big Caslon Medium" w:eastAsia="Big Caslon Medium" w:cs="Big Caslon Medium"/>
+          <w:sz w:val="15"/>
+          <w:szCs w:val="15"/>
+        </w:rPr>
+      </w:pPr>
+      <w:r>
+        <w:rPr>
+          <w:rFonts w:ascii="Big Caslon Medium" w:hAnsi="Big Caslon Medium" w:eastAsia="Big Caslon Medium" w:cs="Big Caslon Medium"/>
           <w:sz w:val="15"/>
           <w:szCs w:val="15"/>
         </w:rPr>
@@ -5491,14 +5491,14 @@
         <w:jc w:val="left"/>
         <w:widowControl w:val="0"/>
         <w:rPr>
-          <w:rFonts w:ascii="Big Caslon" w:hAnsi="Big Caslon" w:eastAsia="Big Caslon" w:cs="Big Caslon"/>
-          <w:sz w:val="15"/>
-          <w:szCs w:val="15"/>
-        </w:rPr>
-      </w:pPr>
-      <w:r>
-        <w:rPr>
-          <w:rFonts w:ascii="Big Caslon" w:hAnsi="Big Caslon" w:eastAsia="Big Caslon" w:cs="Big Caslon"/>
+          <w:rFonts w:ascii="Big Caslon Medium" w:hAnsi="Big Caslon Medium" w:eastAsia="Big Caslon Medium" w:cs="Big Caslon Medium"/>
+          <w:sz w:val="15"/>
+          <w:szCs w:val="15"/>
+        </w:rPr>
+      </w:pPr>
+      <w:r>
+        <w:rPr>
+          <w:rFonts w:ascii="Big Caslon Medium" w:hAnsi="Big Caslon Medium" w:eastAsia="Big Caslon Medium" w:cs="Big Caslon Medium"/>
           <w:sz w:val="15"/>
           <w:szCs w:val="15"/>
         </w:rPr>
@@ -5511,14 +5511,14 @@
         <w:jc w:val="left"/>
         <w:widowControl w:val="0"/>
         <w:rPr>
-          <w:rFonts w:ascii="Big Caslon" w:hAnsi="Big Caslon" w:eastAsia="Big Caslon" w:cs="Big Caslon"/>
-          <w:sz w:val="15"/>
-          <w:szCs w:val="15"/>
-        </w:rPr>
-      </w:pPr>
-      <w:r>
-        <w:rPr>
-          <w:rFonts w:ascii="Big Caslon" w:hAnsi="Big Caslon" w:eastAsia="Big Caslon" w:cs="Big Caslon"/>
+          <w:rFonts w:ascii="Big Caslon Medium" w:hAnsi="Big Caslon Medium" w:eastAsia="Big Caslon Medium" w:cs="Big Caslon Medium"/>
+          <w:sz w:val="15"/>
+          <w:szCs w:val="15"/>
+        </w:rPr>
+      </w:pPr>
+      <w:r>
+        <w:rPr>
+          <w:rFonts w:ascii="Big Caslon Medium" w:hAnsi="Big Caslon Medium" w:eastAsia="Big Caslon Medium" w:cs="Big Caslon Medium"/>
           <w:sz w:val="15"/>
           <w:szCs w:val="15"/>
         </w:rPr>
@@ -5531,14 +5531,14 @@
         <w:jc w:val="left"/>
         <w:widowControl w:val="0"/>
         <w:rPr>
-          <w:rFonts w:ascii="Big Caslon" w:hAnsi="Big Caslon" w:eastAsia="Big Caslon" w:cs="Big Caslon"/>
-          <w:sz w:val="15"/>
-          <w:szCs w:val="15"/>
-        </w:rPr>
-      </w:pPr>
-      <w:r>
-        <w:rPr>
-          <w:rFonts w:ascii="Big Caslon" w:hAnsi="Big Caslon" w:eastAsia="Big Caslon" w:cs="Big Caslon"/>
+          <w:rFonts w:ascii="Big Caslon Medium" w:hAnsi="Big Caslon Medium" w:eastAsia="Big Caslon Medium" w:cs="Big Caslon Medium"/>
+          <w:sz w:val="15"/>
+          <w:szCs w:val="15"/>
+        </w:rPr>
+      </w:pPr>
+      <w:r>
+        <w:rPr>
+          <w:rFonts w:ascii="Big Caslon Medium" w:hAnsi="Big Caslon Medium" w:eastAsia="Big Caslon Medium" w:cs="Big Caslon Medium"/>
           <w:sz w:val="15"/>
           <w:szCs w:val="15"/>
         </w:rPr>
@@ -5551,14 +5551,14 @@
         <w:jc w:val="left"/>
         <w:widowControl w:val="0"/>
         <w:rPr>
-          <w:rFonts w:ascii="Big Caslon" w:hAnsi="Big Caslon" w:eastAsia="Big Caslon" w:cs="Big Caslon"/>
-          <w:sz w:val="15"/>
-          <w:szCs w:val="15"/>
-        </w:rPr>
-      </w:pPr>
-      <w:r>
-        <w:rPr>
-          <w:rFonts w:ascii="Big Caslon" w:hAnsi="Big Caslon" w:eastAsia="Big Caslon" w:cs="Big Caslon"/>
+          <w:rFonts w:ascii="Big Caslon Medium" w:hAnsi="Big Caslon Medium" w:eastAsia="Big Caslon Medium" w:cs="Big Caslon Medium"/>
+          <w:sz w:val="15"/>
+          <w:szCs w:val="15"/>
+        </w:rPr>
+      </w:pPr>
+      <w:r>
+        <w:rPr>
+          <w:rFonts w:ascii="Big Caslon Medium" w:hAnsi="Big Caslon Medium" w:eastAsia="Big Caslon Medium" w:cs="Big Caslon Medium"/>
           <w:sz w:val="15"/>
           <w:szCs w:val="15"/>
         </w:rPr>
@@ -5571,14 +5571,14 @@
         <w:jc w:val="left"/>
         <w:widowControl w:val="0"/>
         <w:rPr>
-          <w:rFonts w:ascii="Big Caslon" w:hAnsi="Big Caslon" w:eastAsia="Big Caslon" w:cs="Big Caslon"/>
-          <w:sz w:val="15"/>
-          <w:szCs w:val="15"/>
-        </w:rPr>
-      </w:pPr>
-      <w:r>
-        <w:rPr>
-          <w:rFonts w:ascii="Big Caslon" w:hAnsi="Big Caslon" w:eastAsia="Big Caslon" w:cs="Big Caslon"/>
+          <w:rFonts w:ascii="Big Caslon Medium" w:hAnsi="Big Caslon Medium" w:eastAsia="Big Caslon Medium" w:cs="Big Caslon Medium"/>
+          <w:sz w:val="15"/>
+          <w:szCs w:val="15"/>
+        </w:rPr>
+      </w:pPr>
+      <w:r>
+        <w:rPr>
+          <w:rFonts w:ascii="Big Caslon Medium" w:hAnsi="Big Caslon Medium" w:eastAsia="Big Caslon Medium" w:cs="Big Caslon Medium"/>
           <w:sz w:val="15"/>
           <w:szCs w:val="15"/>
         </w:rPr>
@@ -5591,14 +5591,14 @@
         <w:jc w:val="left"/>
         <w:widowControl w:val="0"/>
         <w:rPr>
-          <w:rFonts w:ascii="Big Caslon" w:hAnsi="Big Caslon" w:eastAsia="Big Caslon" w:cs="Big Caslon"/>
-          <w:sz w:val="15"/>
-          <w:szCs w:val="15"/>
-        </w:rPr>
-      </w:pPr>
-      <w:r>
-        <w:rPr>
-          <w:rFonts w:ascii="Big Caslon" w:hAnsi="Big Caslon" w:eastAsia="Big Caslon" w:cs="Big Caslon"/>
+          <w:rFonts w:ascii="Big Caslon Medium" w:hAnsi="Big Caslon Medium" w:eastAsia="Big Caslon Medium" w:cs="Big Caslon Medium"/>
+          <w:sz w:val="15"/>
+          <w:szCs w:val="15"/>
+        </w:rPr>
+      </w:pPr>
+      <w:r>
+        <w:rPr>
+          <w:rFonts w:ascii="Big Caslon Medium" w:hAnsi="Big Caslon Medium" w:eastAsia="Big Caslon Medium" w:cs="Big Caslon Medium"/>
           <w:sz w:val="15"/>
           <w:szCs w:val="15"/>
         </w:rPr>
@@ -5611,14 +5611,14 @@
         <w:jc w:val="left"/>
         <w:widowControl w:val="0"/>
         <w:rPr>
-          <w:rFonts w:ascii="Big Caslon" w:hAnsi="Big Caslon" w:eastAsia="Big Caslon" w:cs="Big Caslon"/>
-          <w:sz w:val="15"/>
-          <w:szCs w:val="15"/>
-        </w:rPr>
-      </w:pPr>
-      <w:r>
-        <w:rPr>
-          <w:rFonts w:ascii="Big Caslon" w:hAnsi="Big Caslon" w:eastAsia="Big Caslon" w:cs="Big Caslon"/>
+          <w:rFonts w:ascii="Big Caslon Medium" w:hAnsi="Big Caslon Medium" w:eastAsia="Big Caslon Medium" w:cs="Big Caslon Medium"/>
+          <w:sz w:val="15"/>
+          <w:szCs w:val="15"/>
+        </w:rPr>
+      </w:pPr>
+      <w:r>
+        <w:rPr>
+          <w:rFonts w:ascii="Big Caslon Medium" w:hAnsi="Big Caslon Medium" w:eastAsia="Big Caslon Medium" w:cs="Big Caslon Medium"/>
           <w:sz w:val="15"/>
           <w:szCs w:val="15"/>
         </w:rPr>
@@ -5631,14 +5631,14 @@
         <w:jc w:val="left"/>
         <w:widowControl w:val="0"/>
         <w:rPr>
-          <w:rFonts w:ascii="Big Caslon" w:hAnsi="Big Caslon" w:eastAsia="Big Caslon" w:cs="Big Caslon"/>
-          <w:sz w:val="15"/>
-          <w:szCs w:val="15"/>
-        </w:rPr>
-      </w:pPr>
-      <w:r>
-        <w:rPr>
-          <w:rFonts w:ascii="Big Caslon" w:hAnsi="Big Caslon" w:eastAsia="Big Caslon" w:cs="Big Caslon"/>
+          <w:rFonts w:ascii="Big Caslon Medium" w:hAnsi="Big Caslon Medium" w:eastAsia="Big Caslon Medium" w:cs="Big Caslon Medium"/>
+          <w:sz w:val="15"/>
+          <w:szCs w:val="15"/>
+        </w:rPr>
+      </w:pPr>
+      <w:r>
+        <w:rPr>
+          <w:rFonts w:ascii="Big Caslon Medium" w:hAnsi="Big Caslon Medium" w:eastAsia="Big Caslon Medium" w:cs="Big Caslon Medium"/>
           <w:sz w:val="15"/>
           <w:szCs w:val="15"/>
         </w:rPr>
@@ -5651,14 +5651,14 @@
         <w:jc w:val="left"/>
         <w:widowControl w:val="0"/>
         <w:rPr>
-          <w:rFonts w:ascii="Big Caslon" w:hAnsi="Big Caslon" w:eastAsia="Big Caslon" w:cs="Big Caslon"/>
-          <w:sz w:val="15"/>
-          <w:szCs w:val="15"/>
-        </w:rPr>
-      </w:pPr>
-      <w:r>
-        <w:rPr>
-          <w:rFonts w:ascii="Big Caslon" w:hAnsi="Big Caslon" w:eastAsia="Big Caslon" w:cs="Big Caslon"/>
+          <w:rFonts w:ascii="Big Caslon Medium" w:hAnsi="Big Caslon Medium" w:eastAsia="Big Caslon Medium" w:cs="Big Caslon Medium"/>
+          <w:sz w:val="15"/>
+          <w:szCs w:val="15"/>
+        </w:rPr>
+      </w:pPr>
+      <w:r>
+        <w:rPr>
+          <w:rFonts w:ascii="Big Caslon Medium" w:hAnsi="Big Caslon Medium" w:eastAsia="Big Caslon Medium" w:cs="Big Caslon Medium"/>
           <w:sz w:val="15"/>
           <w:szCs w:val="15"/>
         </w:rPr>
@@ -5671,14 +5671,14 @@
         <w:jc w:val="left"/>
         <w:widowControl w:val="0"/>
         <w:rPr>
-          <w:rFonts w:ascii="Big Caslon" w:hAnsi="Big Caslon" w:eastAsia="Big Caslon" w:cs="Big Caslon"/>
-          <w:sz w:val="15"/>
-          <w:szCs w:val="15"/>
-        </w:rPr>
-      </w:pPr>
-      <w:r>
-        <w:rPr>
-          <w:rFonts w:ascii="Big Caslon" w:hAnsi="Big Caslon" w:eastAsia="Big Caslon" w:cs="Big Caslon"/>
+          <w:rFonts w:ascii="Big Caslon Medium" w:hAnsi="Big Caslon Medium" w:eastAsia="Big Caslon Medium" w:cs="Big Caslon Medium"/>
+          <w:sz w:val="15"/>
+          <w:szCs w:val="15"/>
+        </w:rPr>
+      </w:pPr>
+      <w:r>
+        <w:rPr>
+          <w:rFonts w:ascii="Big Caslon Medium" w:hAnsi="Big Caslon Medium" w:eastAsia="Big Caslon Medium" w:cs="Big Caslon Medium"/>
           <w:sz w:val="15"/>
           <w:szCs w:val="15"/>
         </w:rPr>
@@ -5691,14 +5691,14 @@
         <w:jc w:val="left"/>
         <w:widowControl w:val="0"/>
         <w:rPr>
-          <w:rFonts w:ascii="Big Caslon" w:hAnsi="Big Caslon" w:eastAsia="Big Caslon" w:cs="Big Caslon"/>
-          <w:sz w:val="15"/>
-          <w:szCs w:val="15"/>
-        </w:rPr>
-      </w:pPr>
-      <w:r>
-        <w:rPr>
-          <w:rFonts w:ascii="Big Caslon" w:hAnsi="Big Caslon" w:eastAsia="Big Caslon" w:cs="Big Caslon"/>
+          <w:rFonts w:ascii="Big Caslon Medium" w:hAnsi="Big Caslon Medium" w:eastAsia="Big Caslon Medium" w:cs="Big Caslon Medium"/>
+          <w:sz w:val="15"/>
+          <w:szCs w:val="15"/>
+        </w:rPr>
+      </w:pPr>
+      <w:r>
+        <w:rPr>
+          <w:rFonts w:ascii="Big Caslon Medium" w:hAnsi="Big Caslon Medium" w:eastAsia="Big Caslon Medium" w:cs="Big Caslon Medium"/>
           <w:sz w:val="15"/>
           <w:szCs w:val="15"/>
         </w:rPr>
@@ -5711,14 +5711,14 @@
         <w:jc w:val="left"/>
         <w:widowControl w:val="0"/>
         <w:rPr>
-          <w:rFonts w:ascii="Big Caslon" w:hAnsi="Big Caslon" w:eastAsia="Big Caslon" w:cs="Big Caslon"/>
-          <w:sz w:val="15"/>
-          <w:szCs w:val="15"/>
-        </w:rPr>
-      </w:pPr>
-      <w:r>
-        <w:rPr>
-          <w:rFonts w:ascii="Big Caslon" w:hAnsi="Big Caslon" w:eastAsia="Big Caslon" w:cs="Big Caslon"/>
+          <w:rFonts w:ascii="Big Caslon Medium" w:hAnsi="Big Caslon Medium" w:eastAsia="Big Caslon Medium" w:cs="Big Caslon Medium"/>
+          <w:sz w:val="15"/>
+          <w:szCs w:val="15"/>
+        </w:rPr>
+      </w:pPr>
+      <w:r>
+        <w:rPr>
+          <w:rFonts w:ascii="Big Caslon Medium" w:hAnsi="Big Caslon Medium" w:eastAsia="Big Caslon Medium" w:cs="Big Caslon Medium"/>
           <w:sz w:val="15"/>
           <w:szCs w:val="15"/>
         </w:rPr>
@@ -5731,14 +5731,14 @@
         <w:jc w:val="left"/>
         <w:widowControl w:val="0"/>
         <w:rPr>
-          <w:rFonts w:ascii="Big Caslon" w:hAnsi="Big Caslon" w:eastAsia="Big Caslon" w:cs="Big Caslon"/>
-          <w:sz w:val="15"/>
-          <w:szCs w:val="15"/>
-        </w:rPr>
-      </w:pPr>
-      <w:r>
-        <w:rPr>
-          <w:rFonts w:ascii="Big Caslon" w:hAnsi="Big Caslon" w:eastAsia="Big Caslon" w:cs="Big Caslon"/>
+          <w:rFonts w:ascii="Big Caslon Medium" w:hAnsi="Big Caslon Medium" w:eastAsia="Big Caslon Medium" w:cs="Big Caslon Medium"/>
+          <w:sz w:val="15"/>
+          <w:szCs w:val="15"/>
+        </w:rPr>
+      </w:pPr>
+      <w:r>
+        <w:rPr>
+          <w:rFonts w:ascii="Big Caslon Medium" w:hAnsi="Big Caslon Medium" w:eastAsia="Big Caslon Medium" w:cs="Big Caslon Medium"/>
           <w:sz w:val="15"/>
           <w:szCs w:val="15"/>
         </w:rPr>
@@ -5751,14 +5751,14 @@
         <w:jc w:val="left"/>
         <w:widowControl w:val="0"/>
         <w:rPr>
-          <w:rFonts w:ascii="Big Caslon" w:hAnsi="Big Caslon" w:eastAsia="Big Caslon" w:cs="Big Caslon"/>
-          <w:sz w:val="15"/>
-          <w:szCs w:val="15"/>
-        </w:rPr>
-      </w:pPr>
-      <w:r>
-        <w:rPr>
-          <w:rFonts w:ascii="Big Caslon" w:hAnsi="Big Caslon" w:eastAsia="Big Caslon" w:cs="Big Caslon"/>
+          <w:rFonts w:ascii="Big Caslon Medium" w:hAnsi="Big Caslon Medium" w:eastAsia="Big Caslon Medium" w:cs="Big Caslon Medium"/>
+          <w:sz w:val="15"/>
+          <w:szCs w:val="15"/>
+        </w:rPr>
+      </w:pPr>
+      <w:r>
+        <w:rPr>
+          <w:rFonts w:ascii="Big Caslon Medium" w:hAnsi="Big Caslon Medium" w:eastAsia="Big Caslon Medium" w:cs="Big Caslon Medium"/>
           <w:sz w:val="15"/>
           <w:szCs w:val="15"/>
         </w:rPr>
@@ -5771,14 +5771,14 @@
         <w:jc w:val="left"/>
         <w:widowControl w:val="0"/>
         <w:rPr>
-          <w:rFonts w:ascii="Big Caslon" w:hAnsi="Big Caslon" w:eastAsia="Big Caslon" w:cs="Big Caslon"/>
-          <w:sz w:val="15"/>
-          <w:szCs w:val="15"/>
-        </w:rPr>
-      </w:pPr>
-      <w:r>
-        <w:rPr>
-          <w:rFonts w:ascii="Big Caslon" w:hAnsi="Big Caslon" w:eastAsia="Big Caslon" w:cs="Big Caslon"/>
+          <w:rFonts w:ascii="Big Caslon Medium" w:hAnsi="Big Caslon Medium" w:eastAsia="Big Caslon Medium" w:cs="Big Caslon Medium"/>
+          <w:sz w:val="15"/>
+          <w:szCs w:val="15"/>
+        </w:rPr>
+      </w:pPr>
+      <w:r>
+        <w:rPr>
+          <w:rFonts w:ascii="Big Caslon Medium" w:hAnsi="Big Caslon Medium" w:eastAsia="Big Caslon Medium" w:cs="Big Caslon Medium"/>
           <w:sz w:val="15"/>
           <w:szCs w:val="15"/>
         </w:rPr>
@@ -5791,14 +5791,14 @@
         <w:jc w:val="left"/>
         <w:widowControl w:val="0"/>
         <w:rPr>
-          <w:rFonts w:ascii="Big Caslon" w:hAnsi="Big Caslon" w:eastAsia="Big Caslon" w:cs="Big Caslon"/>
-          <w:sz w:val="15"/>
-          <w:szCs w:val="15"/>
-        </w:rPr>
-      </w:pPr>
-      <w:r>
-        <w:rPr>
-          <w:rFonts w:ascii="Big Caslon" w:hAnsi="Big Caslon" w:eastAsia="Big Caslon" w:cs="Big Caslon"/>
+          <w:rFonts w:ascii="Big Caslon Medium" w:hAnsi="Big Caslon Medium" w:eastAsia="Big Caslon Medium" w:cs="Big Caslon Medium"/>
+          <w:sz w:val="15"/>
+          <w:szCs w:val="15"/>
+        </w:rPr>
+      </w:pPr>
+      <w:r>
+        <w:rPr>
+          <w:rFonts w:ascii="Big Caslon Medium" w:hAnsi="Big Caslon Medium" w:eastAsia="Big Caslon Medium" w:cs="Big Caslon Medium"/>
           <w:sz w:val="15"/>
           <w:szCs w:val="15"/>
         </w:rPr>
@@ -5811,14 +5811,14 @@
         <w:jc w:val="left"/>
         <w:widowControl w:val="0"/>
         <w:rPr>
-          <w:rFonts w:ascii="Big Caslon" w:hAnsi="Big Caslon" w:eastAsia="Big Caslon" w:cs="Big Caslon"/>
-          <w:sz w:val="15"/>
-          <w:szCs w:val="15"/>
-        </w:rPr>
-      </w:pPr>
-      <w:r>
-        <w:rPr>
-          <w:rFonts w:ascii="Big Caslon" w:hAnsi="Big Caslon" w:eastAsia="Big Caslon" w:cs="Big Caslon"/>
+          <w:rFonts w:ascii="Big Caslon Medium" w:hAnsi="Big Caslon Medium" w:eastAsia="Big Caslon Medium" w:cs="Big Caslon Medium"/>
+          <w:sz w:val="15"/>
+          <w:szCs w:val="15"/>
+        </w:rPr>
+      </w:pPr>
+      <w:r>
+        <w:rPr>
+          <w:rFonts w:ascii="Big Caslon Medium" w:hAnsi="Big Caslon Medium" w:eastAsia="Big Caslon Medium" w:cs="Big Caslon Medium"/>
           <w:sz w:val="15"/>
           <w:szCs w:val="15"/>
         </w:rPr>
@@ -5831,14 +5831,14 @@
         <w:jc w:val="left"/>
         <w:widowControl w:val="0"/>
         <w:rPr>
-          <w:rFonts w:ascii="Big Caslon" w:hAnsi="Big Caslon" w:eastAsia="Big Caslon" w:cs="Big Caslon"/>
-          <w:sz w:val="15"/>
-          <w:szCs w:val="15"/>
-        </w:rPr>
-      </w:pPr>
-      <w:r>
-        <w:rPr>
-          <w:rFonts w:ascii="Big Caslon" w:hAnsi="Big Caslon" w:eastAsia="Big Caslon" w:cs="Big Caslon"/>
+          <w:rFonts w:ascii="Big Caslon Medium" w:hAnsi="Big Caslon Medium" w:eastAsia="Big Caslon Medium" w:cs="Big Caslon Medium"/>
+          <w:sz w:val="15"/>
+          <w:szCs w:val="15"/>
+        </w:rPr>
+      </w:pPr>
+      <w:r>
+        <w:rPr>
+          <w:rFonts w:ascii="Big Caslon Medium" w:hAnsi="Big Caslon Medium" w:eastAsia="Big Caslon Medium" w:cs="Big Caslon Medium"/>
           <w:sz w:val="15"/>
           <w:szCs w:val="15"/>
         </w:rPr>
@@ -5851,14 +5851,14 @@
         <w:jc w:val="left"/>
         <w:widowControl w:val="0"/>
         <w:rPr>
-          <w:rFonts w:ascii="Big Caslon" w:hAnsi="Big Caslon" w:eastAsia="Big Caslon" w:cs="Big Caslon"/>
-          <w:sz w:val="15"/>
-          <w:szCs w:val="15"/>
-        </w:rPr>
-      </w:pPr>
-      <w:r>
-        <w:rPr>
-          <w:rFonts w:ascii="Big Caslon" w:hAnsi="Big Caslon" w:eastAsia="Big Caslon" w:cs="Big Caslon"/>
+          <w:rFonts w:ascii="Big Caslon Medium" w:hAnsi="Big Caslon Medium" w:eastAsia="Big Caslon Medium" w:cs="Big Caslon Medium"/>
+          <w:sz w:val="15"/>
+          <w:szCs w:val="15"/>
+        </w:rPr>
+      </w:pPr>
+      <w:r>
+        <w:rPr>
+          <w:rFonts w:ascii="Big Caslon Medium" w:hAnsi="Big Caslon Medium" w:eastAsia="Big Caslon Medium" w:cs="Big Caslon Medium"/>
           <w:sz w:val="15"/>
           <w:szCs w:val="15"/>
         </w:rPr>
@@ -5871,14 +5871,14 @@
         <w:jc w:val="left"/>
         <w:widowControl w:val="0"/>
         <w:rPr>
-          <w:rFonts w:ascii="Big Caslon" w:hAnsi="Big Caslon" w:eastAsia="Big Caslon" w:cs="Big Caslon"/>
-          <w:sz w:val="15"/>
-          <w:szCs w:val="15"/>
-        </w:rPr>
-      </w:pPr>
-      <w:r>
-        <w:rPr>
-          <w:rFonts w:ascii="Big Caslon" w:hAnsi="Big Caslon" w:eastAsia="Big Caslon" w:cs="Big Caslon"/>
+          <w:rFonts w:ascii="Big Caslon Medium" w:hAnsi="Big Caslon Medium" w:eastAsia="Big Caslon Medium" w:cs="Big Caslon Medium"/>
+          <w:sz w:val="15"/>
+          <w:szCs w:val="15"/>
+        </w:rPr>
+      </w:pPr>
+      <w:r>
+        <w:rPr>
+          <w:rFonts w:ascii="Big Caslon Medium" w:hAnsi="Big Caslon Medium" w:eastAsia="Big Caslon Medium" w:cs="Big Caslon Medium"/>
           <w:sz w:val="15"/>
           <w:szCs w:val="15"/>
         </w:rPr>
@@ -5891,14 +5891,14 @@
         <w:jc w:val="left"/>
         <w:widowControl w:val="0"/>
         <w:rPr>
-          <w:rFonts w:ascii="Big Caslon" w:hAnsi="Big Caslon" w:eastAsia="Big Caslon" w:cs="Big Caslon"/>
-          <w:sz w:val="15"/>
-          <w:szCs w:val="15"/>
-        </w:rPr>
-      </w:pPr>
-      <w:r>
-        <w:rPr>
-          <w:rFonts w:ascii="Big Caslon" w:hAnsi="Big Caslon" w:eastAsia="Big Caslon" w:cs="Big Caslon"/>
+          <w:rFonts w:ascii="Big Caslon Medium" w:hAnsi="Big Caslon Medium" w:eastAsia="Big Caslon Medium" w:cs="Big Caslon Medium"/>
+          <w:sz w:val="15"/>
+          <w:szCs w:val="15"/>
+        </w:rPr>
+      </w:pPr>
+      <w:r>
+        <w:rPr>
+          <w:rFonts w:ascii="Big Caslon Medium" w:hAnsi="Big Caslon Medium" w:eastAsia="Big Caslon Medium" w:cs="Big Caslon Medium"/>
           <w:sz w:val="15"/>
           <w:szCs w:val="15"/>
         </w:rPr>
@@ -5911,14 +5911,14 @@
         <w:jc w:val="left"/>
         <w:widowControl w:val="0"/>
         <w:rPr>
-          <w:rFonts w:ascii="Big Caslon" w:hAnsi="Big Caslon" w:eastAsia="Big Caslon" w:cs="Big Caslon"/>
-          <w:sz w:val="15"/>
-          <w:szCs w:val="15"/>
-        </w:rPr>
-      </w:pPr>
-      <w:r>
-        <w:rPr>
-          <w:rFonts w:ascii="Big Caslon" w:hAnsi="Big Caslon" w:eastAsia="Big Caslon" w:cs="Big Caslon"/>
+          <w:rFonts w:ascii="Big Caslon Medium" w:hAnsi="Big Caslon Medium" w:eastAsia="Big Caslon Medium" w:cs="Big Caslon Medium"/>
+          <w:sz w:val="15"/>
+          <w:szCs w:val="15"/>
+        </w:rPr>
+      </w:pPr>
+      <w:r>
+        <w:rPr>
+          <w:rFonts w:ascii="Big Caslon Medium" w:hAnsi="Big Caslon Medium" w:eastAsia="Big Caslon Medium" w:cs="Big Caslon Medium"/>
           <w:sz w:val="15"/>
           <w:szCs w:val="15"/>
         </w:rPr>
@@ -5931,14 +5931,14 @@
         <w:jc w:val="left"/>
         <w:widowControl w:val="0"/>
         <w:rPr>
-          <w:rFonts w:ascii="Big Caslon" w:hAnsi="Big Caslon" w:eastAsia="Big Caslon" w:cs="Big Caslon"/>
-          <w:sz w:val="15"/>
-          <w:szCs w:val="15"/>
-        </w:rPr>
-      </w:pPr>
-      <w:r>
-        <w:rPr>
-          <w:rFonts w:ascii="Big Caslon" w:hAnsi="Big Caslon" w:eastAsia="Big Caslon" w:cs="Big Caslon"/>
+          <w:rFonts w:ascii="Big Caslon Medium" w:hAnsi="Big Caslon Medium" w:eastAsia="Big Caslon Medium" w:cs="Big Caslon Medium"/>
+          <w:sz w:val="15"/>
+          <w:szCs w:val="15"/>
+        </w:rPr>
+      </w:pPr>
+      <w:r>
+        <w:rPr>
+          <w:rFonts w:ascii="Big Caslon Medium" w:hAnsi="Big Caslon Medium" w:eastAsia="Big Caslon Medium" w:cs="Big Caslon Medium"/>
           <w:sz w:val="15"/>
           <w:szCs w:val="15"/>
         </w:rPr>
@@ -5951,14 +5951,14 @@
         <w:jc w:val="left"/>
         <w:widowControl w:val="0"/>
         <w:rPr>
-          <w:rFonts w:ascii="Big Caslon" w:hAnsi="Big Caslon" w:eastAsia="Big Caslon" w:cs="Big Caslon"/>
-          <w:sz w:val="15"/>
-          <w:szCs w:val="15"/>
-        </w:rPr>
-      </w:pPr>
-      <w:r>
-        <w:rPr>
-          <w:rFonts w:ascii="Big Caslon" w:hAnsi="Big Caslon" w:eastAsia="Big Caslon" w:cs="Big Caslon"/>
+          <w:rFonts w:ascii="Big Caslon Medium" w:hAnsi="Big Caslon Medium" w:eastAsia="Big Caslon Medium" w:cs="Big Caslon Medium"/>
+          <w:sz w:val="15"/>
+          <w:szCs w:val="15"/>
+        </w:rPr>
+      </w:pPr>
+      <w:r>
+        <w:rPr>
+          <w:rFonts w:ascii="Big Caslon Medium" w:hAnsi="Big Caslon Medium" w:eastAsia="Big Caslon Medium" w:cs="Big Caslon Medium"/>
           <w:sz w:val="15"/>
           <w:szCs w:val="15"/>
         </w:rPr>
@@ -5971,14 +5971,14 @@
         <w:jc w:val="left"/>
         <w:widowControl w:val="0"/>
         <w:rPr>
-          <w:rFonts w:ascii="Big Caslon" w:hAnsi="Big Caslon" w:eastAsia="Big Caslon" w:cs="Big Caslon"/>
-          <w:sz w:val="15"/>
-          <w:szCs w:val="15"/>
-        </w:rPr>
-      </w:pPr>
-      <w:r>
-        <w:rPr>
-          <w:rFonts w:ascii="Big Caslon" w:hAnsi="Big Caslon" w:eastAsia="Big Caslon" w:cs="Big Caslon"/>
+          <w:rFonts w:ascii="Big Caslon Medium" w:hAnsi="Big Caslon Medium" w:eastAsia="Big Caslon Medium" w:cs="Big Caslon Medium"/>
+          <w:sz w:val="15"/>
+          <w:szCs w:val="15"/>
+        </w:rPr>
+      </w:pPr>
+      <w:r>
+        <w:rPr>
+          <w:rFonts w:ascii="Big Caslon Medium" w:hAnsi="Big Caslon Medium" w:eastAsia="Big Caslon Medium" w:cs="Big Caslon Medium"/>
           <w:sz w:val="15"/>
           <w:szCs w:val="15"/>
         </w:rPr>
@@ -5991,14 +5991,14 @@
         <w:jc w:val="left"/>
         <w:widowControl w:val="0"/>
         <w:rPr>
-          <w:rFonts w:ascii="Big Caslon" w:hAnsi="Big Caslon" w:eastAsia="Big Caslon" w:cs="Big Caslon"/>
-          <w:sz w:val="15"/>
-          <w:szCs w:val="15"/>
-        </w:rPr>
-      </w:pPr>
-      <w:r>
-        <w:rPr>
-          <w:rFonts w:ascii="Big Caslon" w:hAnsi="Big Caslon" w:eastAsia="Big Caslon" w:cs="Big Caslon"/>
+          <w:rFonts w:ascii="Big Caslon Medium" w:hAnsi="Big Caslon Medium" w:eastAsia="Big Caslon Medium" w:cs="Big Caslon Medium"/>
+          <w:sz w:val="15"/>
+          <w:szCs w:val="15"/>
+        </w:rPr>
+      </w:pPr>
+      <w:r>
+        <w:rPr>
+          <w:rFonts w:ascii="Big Caslon Medium" w:hAnsi="Big Caslon Medium" w:eastAsia="Big Caslon Medium" w:cs="Big Caslon Medium"/>
           <w:sz w:val="15"/>
           <w:szCs w:val="15"/>
         </w:rPr>
@@ -6011,14 +6011,14 @@
         <w:jc w:val="left"/>
         <w:widowControl w:val="0"/>
         <w:rPr>
-          <w:rFonts w:ascii="Big Caslon" w:hAnsi="Big Caslon" w:eastAsia="Big Caslon" w:cs="Big Caslon"/>
-          <w:sz w:val="15"/>
-          <w:szCs w:val="15"/>
-        </w:rPr>
-      </w:pPr>
-      <w:r>
-        <w:rPr>
-          <w:rFonts w:ascii="Big Caslon" w:hAnsi="Big Caslon" w:eastAsia="Big Caslon" w:cs="Big Caslon"/>
+          <w:rFonts w:ascii="Big Caslon Medium" w:hAnsi="Big Caslon Medium" w:eastAsia="Big Caslon Medium" w:cs="Big Caslon Medium"/>
+          <w:sz w:val="15"/>
+          <w:szCs w:val="15"/>
+        </w:rPr>
+      </w:pPr>
+      <w:r>
+        <w:rPr>
+          <w:rFonts w:ascii="Big Caslon Medium" w:hAnsi="Big Caslon Medium" w:eastAsia="Big Caslon Medium" w:cs="Big Caslon Medium"/>
           <w:sz w:val="15"/>
           <w:szCs w:val="15"/>
         </w:rPr>
@@ -6031,14 +6031,14 @@
         <w:jc w:val="left"/>
         <w:widowControl w:val="0"/>
         <w:rPr>
-          <w:rFonts w:ascii="Big Caslon" w:hAnsi="Big Caslon" w:eastAsia="Big Caslon" w:cs="Big Caslon"/>
-          <w:sz w:val="15"/>
-          <w:szCs w:val="15"/>
-        </w:rPr>
-      </w:pPr>
-      <w:r>
-        <w:rPr>
-          <w:rFonts w:ascii="Big Caslon" w:hAnsi="Big Caslon" w:eastAsia="Big Caslon" w:cs="Big Caslon"/>
+          <w:rFonts w:ascii="Big Caslon Medium" w:hAnsi="Big Caslon Medium" w:eastAsia="Big Caslon Medium" w:cs="Big Caslon Medium"/>
+          <w:sz w:val="15"/>
+          <w:szCs w:val="15"/>
+        </w:rPr>
+      </w:pPr>
+      <w:r>
+        <w:rPr>
+          <w:rFonts w:ascii="Big Caslon Medium" w:hAnsi="Big Caslon Medium" w:eastAsia="Big Caslon Medium" w:cs="Big Caslon Medium"/>
           <w:sz w:val="15"/>
           <w:szCs w:val="15"/>
         </w:rPr>
@@ -6051,14 +6051,14 @@
         <w:jc w:val="left"/>
         <w:widowControl w:val="0"/>
         <w:rPr>
-          <w:rFonts w:ascii="Big Caslon" w:hAnsi="Big Caslon" w:eastAsia="Big Caslon" w:cs="Big Caslon"/>
-          <w:sz w:val="15"/>
-          <w:szCs w:val="15"/>
-        </w:rPr>
-      </w:pPr>
-      <w:r>
-        <w:rPr>
-          <w:rFonts w:ascii="Big Caslon" w:hAnsi="Big Caslon" w:eastAsia="Big Caslon" w:cs="Big Caslon"/>
+          <w:rFonts w:ascii="Big Caslon Medium" w:hAnsi="Big Caslon Medium" w:eastAsia="Big Caslon Medium" w:cs="Big Caslon Medium"/>
+          <w:sz w:val="15"/>
+          <w:szCs w:val="15"/>
+        </w:rPr>
+      </w:pPr>
+      <w:r>
+        <w:rPr>
+          <w:rFonts w:ascii="Big Caslon Medium" w:hAnsi="Big Caslon Medium" w:eastAsia="Big Caslon Medium" w:cs="Big Caslon Medium"/>
           <w:sz w:val="15"/>
           <w:szCs w:val="15"/>
         </w:rPr>
@@ -6071,14 +6071,14 @@
         <w:jc w:val="left"/>
         <w:widowControl w:val="0"/>
         <w:rPr>
-          <w:rFonts w:ascii="Big Caslon" w:hAnsi="Big Caslon" w:eastAsia="Big Caslon" w:cs="Big Caslon"/>
-          <w:sz w:val="15"/>
-          <w:szCs w:val="15"/>
-        </w:rPr>
-      </w:pPr>
-      <w:r>
-        <w:rPr>
-          <w:rFonts w:ascii="Big Caslon" w:hAnsi="Big Caslon" w:eastAsia="Big Caslon" w:cs="Big Caslon"/>
+          <w:rFonts w:ascii="Big Caslon Medium" w:hAnsi="Big Caslon Medium" w:eastAsia="Big Caslon Medium" w:cs="Big Caslon Medium"/>
+          <w:sz w:val="15"/>
+          <w:szCs w:val="15"/>
+        </w:rPr>
+      </w:pPr>
+      <w:r>
+        <w:rPr>
+          <w:rFonts w:ascii="Big Caslon Medium" w:hAnsi="Big Caslon Medium" w:eastAsia="Big Caslon Medium" w:cs="Big Caslon Medium"/>
           <w:sz w:val="15"/>
           <w:szCs w:val="15"/>
         </w:rPr>
@@ -6091,14 +6091,14 @@
         <w:jc w:val="left"/>
         <w:widowControl w:val="0"/>
         <w:rPr>
-          <w:rFonts w:ascii="Big Caslon" w:hAnsi="Big Caslon" w:eastAsia="Big Caslon" w:cs="Big Caslon"/>
-          <w:sz w:val="15"/>
-          <w:szCs w:val="15"/>
-        </w:rPr>
-      </w:pPr>
-      <w:r>
-        <w:rPr>
-          <w:rFonts w:ascii="Big Caslon" w:hAnsi="Big Caslon" w:eastAsia="Big Caslon" w:cs="Big Caslon"/>
+          <w:rFonts w:ascii="Big Caslon Medium" w:hAnsi="Big Caslon Medium" w:eastAsia="Big Caslon Medium" w:cs="Big Caslon Medium"/>
+          <w:sz w:val="15"/>
+          <w:szCs w:val="15"/>
+        </w:rPr>
+      </w:pPr>
+      <w:r>
+        <w:rPr>
+          <w:rFonts w:ascii="Big Caslon Medium" w:hAnsi="Big Caslon Medium" w:eastAsia="Big Caslon Medium" w:cs="Big Caslon Medium"/>
           <w:sz w:val="15"/>
           <w:szCs w:val="15"/>
         </w:rPr>
@@ -6111,14 +6111,14 @@
         <w:jc w:val="left"/>
         <w:widowControl w:val="0"/>
         <w:rPr>
-          <w:rFonts w:ascii="Big Caslon" w:hAnsi="Big Caslon" w:eastAsia="Big Caslon" w:cs="Big Caslon"/>
-          <w:sz w:val="15"/>
-          <w:szCs w:val="15"/>
-        </w:rPr>
-      </w:pPr>
-      <w:r>
-        <w:rPr>
-          <w:rFonts w:ascii="Big Caslon" w:hAnsi="Big Caslon" w:eastAsia="Big Caslon" w:cs="Big Caslon"/>
+          <w:rFonts w:ascii="Big Caslon Medium" w:hAnsi="Big Caslon Medium" w:eastAsia="Big Caslon Medium" w:cs="Big Caslon Medium"/>
+          <w:sz w:val="15"/>
+          <w:szCs w:val="15"/>
+        </w:rPr>
+      </w:pPr>
+      <w:r>
+        <w:rPr>
+          <w:rFonts w:ascii="Big Caslon Medium" w:hAnsi="Big Caslon Medium" w:eastAsia="Big Caslon Medium" w:cs="Big Caslon Medium"/>
           <w:sz w:val="15"/>
           <w:szCs w:val="15"/>
         </w:rPr>

</xml_diff>